<commit_message>
feat: add historical market data models
</commit_message>
<xml_diff>
--- a/docs/TDD.docx
+++ b/docs/TDD.docx
@@ -119,7 +119,7 @@
     <w:p>
       <w:r>
         <w:pict>
-          <v:rect id="_x0000_i1109" style="width:0;height:1.5pt" o:hralign="center" o:hrstd="t" o:hr="t" fillcolor="#a0a0a0" stroked="f"/>
+          <v:rect id="_x0000_i1025" style="width:0;height:1.5pt" o:hralign="center" o:hrstd="t" o:hr="t" fillcolor="#a0a0a0" stroked="f"/>
         </w:pict>
       </w:r>
     </w:p>
@@ -315,7 +315,7 @@
     <w:p>
       <w:r>
         <w:pict>
-          <v:rect id="_x0000_i1110" style="width:0;height:1.5pt" o:hralign="center" o:hrstd="t" o:hr="t" fillcolor="#a0a0a0" stroked="f"/>
+          <v:rect id="_x0000_i1026" style="width:0;height:1.5pt" o:hralign="center" o:hrstd="t" o:hr="t" fillcolor="#a0a0a0" stroked="f"/>
         </w:pict>
       </w:r>
     </w:p>
@@ -483,7 +483,7 @@
     <w:p>
       <w:r>
         <w:pict>
-          <v:rect id="_x0000_i1111" style="width:0;height:1.5pt" o:hralign="center" o:hrstd="t" o:hr="t" fillcolor="#a0a0a0" stroked="f"/>
+          <v:rect id="_x0000_i1027" style="width:0;height:1.5pt" o:hralign="center" o:hrstd="t" o:hr="t" fillcolor="#a0a0a0" stroked="f"/>
         </w:pict>
       </w:r>
     </w:p>
@@ -960,7 +960,7 @@
     <w:p>
       <w:r>
         <w:pict>
-          <v:rect id="_x0000_i1112" style="width:0;height:1.5pt" o:hralign="center" o:hrstd="t" o:hr="t" fillcolor="#a0a0a0" stroked="f"/>
+          <v:rect id="_x0000_i1028" style="width:0;height:1.5pt" o:hralign="center" o:hrstd="t" o:hr="t" fillcolor="#a0a0a0" stroked="f"/>
         </w:pict>
       </w:r>
     </w:p>
@@ -1712,7 +1712,7 @@
     <w:p>
       <w:r>
         <w:pict>
-          <v:rect id="_x0000_i1113" style="width:0;height:1.5pt" o:hralign="center" o:hrstd="t" o:hr="t" fillcolor="#a0a0a0" stroked="f"/>
+          <v:rect id="_x0000_i1029" style="width:0;height:1.5pt" o:hralign="center" o:hrstd="t" o:hr="t" fillcolor="#a0a0a0" stroked="f"/>
         </w:pict>
       </w:r>
     </w:p>
@@ -2026,13 +2026,7 @@
         <w:rPr>
           <w:rStyle w:val="HTMLCode"/>
         </w:rPr>
-        <w:t xml:space="preserve">     </w:t>
-      </w:r>
-      <w:r>
-        <w:rPr>
-          <w:rStyle w:val="HTMLCode"/>
-        </w:rPr>
-        <w:t>|</w:t>
+        <w:t xml:space="preserve">     |</w:t>
       </w:r>
     </w:p>
     <w:p>
@@ -2046,13 +2040,7 @@
         <w:rPr>
           <w:rStyle w:val="HTMLCode"/>
         </w:rPr>
-        <w:t xml:space="preserve">     +--</w:t>
-      </w:r>
-      <w:r>
-        <w:rPr>
-          <w:rStyle w:val="HTMLCode"/>
-        </w:rPr>
-        <w:t xml:space="preserve"> </w:t>
+        <w:t xml:space="preserve">     +-- </w:t>
       </w:r>
       <w:proofErr w:type="spellStart"/>
       <w:r>
@@ -2272,10 +2260,7 @@
         <w:pStyle w:val="HTMLPreformatted"/>
       </w:pPr>
       <w:r>
-        <w:t xml:space="preserve">  </w:t>
-      </w:r>
-      <w:r>
-        <w:t xml:space="preserve">"symbol": </w:t>
+        <w:t xml:space="preserve">  "symbol": </w:t>
       </w:r>
       <w:r>
         <w:rPr>
@@ -2292,10 +2277,7 @@
         <w:pStyle w:val="HTMLPreformatted"/>
       </w:pPr>
       <w:r>
-        <w:t xml:space="preserve">  </w:t>
-      </w:r>
-      <w:r>
-        <w:t xml:space="preserve">"price": </w:t>
+        <w:t xml:space="preserve">  "price": </w:t>
       </w:r>
       <w:r>
         <w:rPr>
@@ -2315,10 +2297,7 @@
         </w:rPr>
       </w:pPr>
       <w:r>
-        <w:t xml:space="preserve">  </w:t>
-      </w:r>
-      <w:r>
-        <w:t xml:space="preserve">"currency": </w:t>
+        <w:t xml:space="preserve">  "currency": </w:t>
       </w:r>
       <w:r>
         <w:rPr>
@@ -2372,7 +2351,7 @@
     <w:p>
       <w:r>
         <w:pict>
-          <v:rect id="_x0000_i1114" style="width:0;height:1.5pt" o:hralign="center" o:hrstd="t" o:hr="t" fillcolor="#a0a0a0" stroked="f"/>
+          <v:rect id="_x0000_i1030" style="width:0;height:1.5pt" o:hralign="center" o:hrstd="t" o:hr="t" fillcolor="#a0a0a0" stroked="f"/>
         </w:pict>
       </w:r>
     </w:p>
@@ -2599,13 +2578,7 @@
         <w:rPr>
           <w:rStyle w:val="HTMLCode"/>
         </w:rPr>
-        <w:t>│   │   └──</w:t>
-      </w:r>
-      <w:r>
-        <w:rPr>
-          <w:rStyle w:val="HTMLCode"/>
-        </w:rPr>
-        <w:t xml:space="preserve"> </w:t>
+        <w:t xml:space="preserve">│   │   └── </w:t>
       </w:r>
       <w:r>
         <w:t>twelve_data_provider.py</w:t>
@@ -2804,13 +2777,7 @@
         <w:rPr>
           <w:rStyle w:val="HTMLCode"/>
         </w:rPr>
-        <w:t>│   └──</w:t>
-      </w:r>
-      <w:r>
-        <w:rPr>
-          <w:rStyle w:val="HTMLCode"/>
-        </w:rPr>
-        <w:t xml:space="preserve"> </w:t>
+        <w:t xml:space="preserve">│   └── </w:t>
       </w:r>
       <w:r>
         <w:t>test_twelve_data_provider.py</w:t>
@@ -2891,7 +2858,7 @@
     <w:p>
       <w:r>
         <w:pict>
-          <v:rect id="_x0000_i1115" style="width:0;height:1.5pt" o:hralign="center" o:hrstd="t" o:hr="t" fillcolor="#a0a0a0" stroked="f"/>
+          <v:rect id="_x0000_i1031" style="width:0;height:1.5pt" o:hralign="center" o:hrstd="t" o:hr="t" fillcolor="#a0a0a0" stroked="f"/>
         </w:pict>
       </w:r>
     </w:p>
@@ -3668,8 +3635,6 @@
       <w:r>
         <w:t>s</w:t>
       </w:r>
-      <w:bookmarkStart w:id="0" w:name="_GoBack"/>
-      <w:bookmarkEnd w:id="0"/>
       <w:r>
         <w:t>:</w:t>
       </w:r>
@@ -3758,7 +3723,7 @@
       <w:r>
         <w:lastRenderedPageBreak/>
         <w:pict>
-          <v:rect id="_x0000_i1116" style="width:0;height:1.5pt" o:hralign="center" o:hrstd="t" o:hr="t" fillcolor="#a0a0a0" stroked="f"/>
+          <v:rect id="_x0000_i1032" style="width:0;height:1.5pt" o:hralign="center" o:hrstd="t" o:hr="t" fillcolor="#a0a0a0" stroked="f"/>
         </w:pict>
       </w:r>
     </w:p>
@@ -4189,18 +4154,6 @@
       <w:r>
         <w:t>raises an error when no market data is returned</w:t>
       </w:r>
-    </w:p>
-    <w:p>
-      <w:pPr>
-        <w:rPr>
-          <w:rFonts w:ascii="Times New Roman" w:eastAsia="Times New Roman" w:hAnsi="Times New Roman" w:cs="Times New Roman"/>
-          <w:b/>
-          <w:bCs/>
-          <w:sz w:val="36"/>
-          <w:szCs w:val="36"/>
-          <w:lang w:eastAsia="en-GB"/>
-        </w:rPr>
-      </w:pPr>
       <w:r>
         <w:br w:type="page"/>
       </w:r>
@@ -4498,9 +4451,9 @@
       </w:tblPr>
       <w:tblGrid>
         <w:gridCol w:w="1335"/>
-        <w:gridCol w:w="1127"/>
-        <w:gridCol w:w="1520"/>
-        <w:gridCol w:w="1642"/>
+        <w:gridCol w:w="3541"/>
+        <w:gridCol w:w="1787"/>
+        <w:gridCol w:w="1535"/>
       </w:tblGrid>
       <w:tr>
         <w:trPr>
@@ -4567,7 +4520,39 @@
                 <w:szCs w:val="24"/>
                 <w:lang w:eastAsia="en-GB"/>
               </w:rPr>
-              <w:t>Symbol</w:t>
+              <w:t>ENUM</w:t>
+            </w:r>
+          </w:p>
+        </w:tc>
+        <w:tc>
+          <w:tcPr>
+            <w:tcW w:w="0" w:type="auto"/>
+            <w:vAlign w:val="center"/>
+            <w:hideMark/>
+          </w:tcPr>
+          <w:p>
+            <w:pPr>
+              <w:spacing w:after="0" w:line="240" w:lineRule="auto"/>
+              <w:jc w:val="center"/>
+              <w:rPr>
+                <w:rFonts w:ascii="Times New Roman" w:eastAsia="Times New Roman" w:hAnsi="Times New Roman" w:cs="Times New Roman"/>
+                <w:b/>
+                <w:bCs/>
+                <w:sz w:val="24"/>
+                <w:szCs w:val="24"/>
+                <w:lang w:eastAsia="en-GB"/>
+              </w:rPr>
+            </w:pPr>
+            <w:r>
+              <w:rPr>
+                <w:rFonts w:ascii="Times New Roman" w:eastAsia="Times New Roman" w:hAnsi="Times New Roman" w:cs="Times New Roman"/>
+                <w:b/>
+                <w:bCs/>
+                <w:sz w:val="24"/>
+                <w:szCs w:val="24"/>
+                <w:lang w:eastAsia="en-GB"/>
+              </w:rPr>
+              <w:t>External Symbol</w:t>
             </w:r>
           </w:p>
         </w:tc>
@@ -4603,38 +4588,6 @@
             </w:r>
           </w:p>
         </w:tc>
-        <w:tc>
-          <w:tcPr>
-            <w:tcW w:w="0" w:type="auto"/>
-            <w:vAlign w:val="center"/>
-            <w:hideMark/>
-          </w:tcPr>
-          <w:p>
-            <w:pPr>
-              <w:spacing w:after="0" w:line="240" w:lineRule="auto"/>
-              <w:jc w:val="center"/>
-              <w:rPr>
-                <w:rFonts w:ascii="Times New Roman" w:eastAsia="Times New Roman" w:hAnsi="Times New Roman" w:cs="Times New Roman"/>
-                <w:b/>
-                <w:bCs/>
-                <w:sz w:val="24"/>
-                <w:szCs w:val="24"/>
-                <w:lang w:eastAsia="en-GB"/>
-              </w:rPr>
-            </w:pPr>
-            <w:r>
-              <w:rPr>
-                <w:rFonts w:ascii="Times New Roman" w:eastAsia="Times New Roman" w:hAnsi="Times New Roman" w:cs="Times New Roman"/>
-                <w:b/>
-                <w:bCs/>
-                <w:sz w:val="24"/>
-                <w:szCs w:val="24"/>
-                <w:lang w:eastAsia="en-GB"/>
-              </w:rPr>
-              <w:t>Status</w:t>
-            </w:r>
-          </w:p>
-        </w:tc>
       </w:tr>
       <w:tr>
         <w:trPr>
@@ -4665,6 +4618,33 @@
               </w:rPr>
               <w:t>Gold Futures</w:t>
             </w:r>
+          </w:p>
+        </w:tc>
+        <w:tc>
+          <w:tcPr>
+            <w:tcW w:w="0" w:type="auto"/>
+            <w:vAlign w:val="center"/>
+            <w:hideMark/>
+          </w:tcPr>
+          <w:p>
+            <w:pPr>
+              <w:spacing w:after="0" w:line="240" w:lineRule="auto"/>
+              <w:rPr>
+                <w:rFonts w:ascii="Times New Roman" w:eastAsia="Times New Roman" w:hAnsi="Times New Roman" w:cs="Times New Roman"/>
+                <w:sz w:val="24"/>
+                <w:szCs w:val="24"/>
+                <w:lang w:eastAsia="en-GB"/>
+              </w:rPr>
+            </w:pPr>
+            <w:proofErr w:type="spellStart"/>
+            <w:r>
+              <w:rPr>
+                <w:rStyle w:val="HTMLCode"/>
+                <w:rFonts w:eastAsiaTheme="minorHAnsi"/>
+              </w:rPr>
+              <w:t>MarketInstrument.GOLD_FUTURES</w:t>
+            </w:r>
+            <w:proofErr w:type="spellEnd"/>
           </w:p>
         </w:tc>
         <w:tc>
@@ -4721,42 +4701,6 @@
             </w:r>
           </w:p>
         </w:tc>
-        <w:tc>
-          <w:tcPr>
-            <w:tcW w:w="0" w:type="auto"/>
-            <w:vAlign w:val="center"/>
-            <w:hideMark/>
-          </w:tcPr>
-          <w:p>
-            <w:pPr>
-              <w:spacing w:after="0" w:line="240" w:lineRule="auto"/>
-              <w:rPr>
-                <w:rFonts w:ascii="Times New Roman" w:eastAsia="Times New Roman" w:hAnsi="Times New Roman" w:cs="Times New Roman"/>
-                <w:sz w:val="24"/>
-                <w:szCs w:val="24"/>
-                <w:lang w:eastAsia="en-GB"/>
-              </w:rPr>
-            </w:pPr>
-            <w:r>
-              <w:rPr>
-                <w:rFonts w:ascii="Segoe UI Symbol" w:eastAsia="Times New Roman" w:hAnsi="Segoe UI Symbol" w:cs="Segoe UI Symbol"/>
-                <w:sz w:val="24"/>
-                <w:szCs w:val="24"/>
-                <w:lang w:eastAsia="en-GB"/>
-              </w:rPr>
-              <w:t>✅</w:t>
-            </w:r>
-            <w:r>
-              <w:rPr>
-                <w:rFonts w:ascii="Times New Roman" w:eastAsia="Times New Roman" w:hAnsi="Times New Roman" w:cs="Times New Roman"/>
-                <w:sz w:val="24"/>
-                <w:szCs w:val="24"/>
-                <w:lang w:eastAsia="en-GB"/>
-              </w:rPr>
-              <w:t xml:space="preserve"> Implemented</w:t>
-            </w:r>
-          </w:p>
-        </w:tc>
       </w:tr>
       <w:tr>
         <w:trPr>
@@ -4787,6 +4731,33 @@
               </w:rPr>
               <w:t>Gold Spot</w:t>
             </w:r>
+          </w:p>
+        </w:tc>
+        <w:tc>
+          <w:tcPr>
+            <w:tcW w:w="0" w:type="auto"/>
+            <w:vAlign w:val="center"/>
+            <w:hideMark/>
+          </w:tcPr>
+          <w:p>
+            <w:pPr>
+              <w:spacing w:after="0" w:line="240" w:lineRule="auto"/>
+              <w:rPr>
+                <w:rFonts w:ascii="Times New Roman" w:eastAsia="Times New Roman" w:hAnsi="Times New Roman" w:cs="Times New Roman"/>
+                <w:sz w:val="24"/>
+                <w:szCs w:val="24"/>
+                <w:lang w:eastAsia="en-GB"/>
+              </w:rPr>
+            </w:pPr>
+            <w:proofErr w:type="spellStart"/>
+            <w:r>
+              <w:rPr>
+                <w:rStyle w:val="HTMLCode"/>
+                <w:rFonts w:eastAsiaTheme="minorHAnsi"/>
+              </w:rPr>
+              <w:t>MarketInstrument.GOLD_SPOT</w:t>
+            </w:r>
+            <w:proofErr w:type="spellEnd"/>
           </w:p>
         </w:tc>
         <w:tc>
@@ -4843,49 +4814,365 @@
             </w:r>
           </w:p>
         </w:tc>
-        <w:tc>
-          <w:tcPr>
-            <w:tcW w:w="0" w:type="auto"/>
-            <w:vAlign w:val="center"/>
-            <w:hideMark/>
-          </w:tcPr>
-          <w:p>
-            <w:pPr>
-              <w:spacing w:after="0" w:line="240" w:lineRule="auto"/>
-              <w:rPr>
-                <w:rFonts w:ascii="Times New Roman" w:eastAsia="Times New Roman" w:hAnsi="Times New Roman" w:cs="Times New Roman"/>
-                <w:sz w:val="24"/>
-                <w:szCs w:val="24"/>
-                <w:lang w:eastAsia="en-GB"/>
-              </w:rPr>
-            </w:pPr>
-            <w:r>
-              <w:rPr>
-                <w:rFonts w:ascii="Segoe UI Symbol" w:eastAsia="Times New Roman" w:hAnsi="Segoe UI Symbol" w:cs="Segoe UI Symbol"/>
-                <w:sz w:val="24"/>
-                <w:szCs w:val="24"/>
-                <w:lang w:eastAsia="en-GB"/>
-              </w:rPr>
-              <w:t>✅</w:t>
-            </w:r>
-            <w:r>
-              <w:rPr>
-                <w:rFonts w:ascii="Times New Roman" w:eastAsia="Times New Roman" w:hAnsi="Times New Roman" w:cs="Times New Roman"/>
-                <w:sz w:val="24"/>
-                <w:szCs w:val="24"/>
-                <w:lang w:eastAsia="en-GB"/>
-              </w:rPr>
-              <w:t xml:space="preserve"> Implemented</w:t>
-            </w:r>
-          </w:p>
-        </w:tc>
       </w:tr>
     </w:tbl>
     <w:p/>
     <w:p>
+      <w:pPr>
+        <w:rPr>
+          <w:rFonts w:ascii="Times New Roman" w:eastAsia="Times New Roman" w:hAnsi="Times New Roman" w:cs="Times New Roman"/>
+          <w:b/>
+          <w:bCs/>
+          <w:sz w:val="36"/>
+          <w:szCs w:val="36"/>
+          <w:lang w:eastAsia="en-GB"/>
+        </w:rPr>
+      </w:pPr>
+      <w:r>
+        <w:br w:type="page"/>
+      </w:r>
+    </w:p>
+    <w:p>
+      <w:pPr>
+        <w:pStyle w:val="Heading2"/>
+      </w:pPr>
+      <w:r>
+        <w:lastRenderedPageBreak/>
+        <w:t>8.7 Historical Market Data Models</w:t>
+      </w:r>
+    </w:p>
+    <w:p>
+      <w:pPr>
+        <w:pStyle w:val="NormalWeb"/>
+      </w:pPr>
+      <w:r>
+        <w:t>Purpose</w:t>
+      </w:r>
+    </w:p>
+    <w:p>
+      <w:pPr>
+        <w:pStyle w:val="NormalWeb"/>
+      </w:pPr>
+      <w:r>
+        <w:t>The historical market data models establish the standard internal representation of historical market data u</w:t>
+      </w:r>
+      <w:r>
+        <w:t>sed throughout the application.</w:t>
+      </w:r>
+    </w:p>
+    <w:p>
+      <w:pPr>
+        <w:rPr>
+          <w:rFonts w:ascii="Times New Roman" w:hAnsi="Times New Roman" w:cs="Times New Roman"/>
+          <w:sz w:val="24"/>
+          <w:szCs w:val="24"/>
+        </w:rPr>
+      </w:pPr>
+      <w:r>
+        <w:rPr>
+          <w:rFonts w:ascii="Times New Roman" w:hAnsi="Times New Roman" w:cs="Times New Roman"/>
+          <w:sz w:val="24"/>
+          <w:szCs w:val="24"/>
+        </w:rPr>
+        <w:t>Implemented models</w:t>
+      </w:r>
+      <w:bookmarkStart w:id="0" w:name="_GoBack"/>
+      <w:bookmarkEnd w:id="0"/>
+    </w:p>
+    <w:p>
+      <w:pPr>
+        <w:pStyle w:val="ListParagraph"/>
+        <w:numPr>
+          <w:ilvl w:val="0"/>
+          <w:numId w:val="46"/>
+        </w:numPr>
+        <w:rPr>
+          <w:rFonts w:ascii="Times New Roman" w:hAnsi="Times New Roman" w:cs="Times New Roman"/>
+          <w:sz w:val="24"/>
+          <w:szCs w:val="24"/>
+        </w:rPr>
+      </w:pPr>
+      <w:proofErr w:type="spellStart"/>
+      <w:r>
+        <w:rPr>
+          <w:rFonts w:ascii="Times New Roman" w:hAnsi="Times New Roman" w:cs="Times New Roman"/>
+          <w:sz w:val="24"/>
+          <w:szCs w:val="24"/>
+        </w:rPr>
+        <w:t>MarketInstrument</w:t>
+      </w:r>
+      <w:proofErr w:type="spellEnd"/>
+    </w:p>
+    <w:p>
+      <w:pPr>
+        <w:pStyle w:val="ListParagraph"/>
+        <w:numPr>
+          <w:ilvl w:val="0"/>
+          <w:numId w:val="46"/>
+        </w:numPr>
+        <w:rPr>
+          <w:rFonts w:ascii="Times New Roman" w:hAnsi="Times New Roman" w:cs="Times New Roman"/>
+          <w:sz w:val="24"/>
+          <w:szCs w:val="24"/>
+        </w:rPr>
+      </w:pPr>
+      <w:proofErr w:type="spellStart"/>
+      <w:r>
+        <w:rPr>
+          <w:rFonts w:ascii="Times New Roman" w:hAnsi="Times New Roman" w:cs="Times New Roman"/>
+          <w:sz w:val="24"/>
+          <w:szCs w:val="24"/>
+        </w:rPr>
+        <w:t>MarketInterval</w:t>
+      </w:r>
+      <w:proofErr w:type="spellEnd"/>
+    </w:p>
+    <w:p>
+      <w:pPr>
+        <w:pStyle w:val="ListParagraph"/>
+        <w:numPr>
+          <w:ilvl w:val="0"/>
+          <w:numId w:val="46"/>
+        </w:numPr>
+        <w:rPr>
+          <w:rFonts w:ascii="Times New Roman" w:hAnsi="Times New Roman" w:cs="Times New Roman"/>
+          <w:sz w:val="24"/>
+          <w:szCs w:val="24"/>
+        </w:rPr>
+      </w:pPr>
+      <w:proofErr w:type="spellStart"/>
+      <w:r>
+        <w:rPr>
+          <w:rFonts w:ascii="Times New Roman" w:hAnsi="Times New Roman" w:cs="Times New Roman"/>
+          <w:sz w:val="24"/>
+          <w:szCs w:val="24"/>
+        </w:rPr>
+        <w:t>MarketCandle</w:t>
+      </w:r>
+      <w:proofErr w:type="spellEnd"/>
+    </w:p>
+    <w:p>
+      <w:pPr>
+        <w:pStyle w:val="ListParagraph"/>
+        <w:numPr>
+          <w:ilvl w:val="0"/>
+          <w:numId w:val="46"/>
+        </w:numPr>
+        <w:rPr>
+          <w:rFonts w:ascii="Times New Roman" w:hAnsi="Times New Roman" w:cs="Times New Roman"/>
+          <w:sz w:val="24"/>
+          <w:szCs w:val="24"/>
+        </w:rPr>
+      </w:pPr>
+      <w:proofErr w:type="spellStart"/>
+      <w:r>
+        <w:rPr>
+          <w:rFonts w:ascii="Times New Roman" w:hAnsi="Times New Roman" w:cs="Times New Roman"/>
+          <w:sz w:val="24"/>
+          <w:szCs w:val="24"/>
+        </w:rPr>
+        <w:t>HistoricalMarketDataRequest</w:t>
+      </w:r>
+      <w:proofErr w:type="spellEnd"/>
+    </w:p>
+    <w:p>
+      <w:pPr>
+        <w:pStyle w:val="ListParagraph"/>
+        <w:numPr>
+          <w:ilvl w:val="0"/>
+          <w:numId w:val="46"/>
+        </w:numPr>
+        <w:rPr>
+          <w:rFonts w:ascii="Times New Roman" w:hAnsi="Times New Roman" w:cs="Times New Roman"/>
+          <w:sz w:val="24"/>
+          <w:szCs w:val="24"/>
+        </w:rPr>
+      </w:pPr>
+      <w:proofErr w:type="spellStart"/>
+      <w:r>
+        <w:rPr>
+          <w:rFonts w:ascii="Times New Roman" w:hAnsi="Times New Roman" w:cs="Times New Roman"/>
+          <w:sz w:val="24"/>
+          <w:szCs w:val="24"/>
+        </w:rPr>
+        <w:t>HistoricalMarketDataResponse</w:t>
+      </w:r>
+      <w:proofErr w:type="spellEnd"/>
+    </w:p>
+    <w:p>
+      <w:pPr>
+        <w:rPr>
+          <w:rFonts w:ascii="Times New Roman" w:hAnsi="Times New Roman" w:cs="Times New Roman"/>
+          <w:sz w:val="24"/>
+          <w:szCs w:val="24"/>
+        </w:rPr>
+      </w:pPr>
+      <w:r>
+        <w:rPr>
+          <w:rFonts w:ascii="Times New Roman" w:hAnsi="Times New Roman" w:cs="Times New Roman"/>
+          <w:sz w:val="24"/>
+          <w:szCs w:val="24"/>
+        </w:rPr>
+        <w:t>Responsibilities</w:t>
+      </w:r>
+    </w:p>
+    <w:p>
+      <w:pPr>
+        <w:pStyle w:val="ListParagraph"/>
+        <w:numPr>
+          <w:ilvl w:val="0"/>
+          <w:numId w:val="47"/>
+        </w:numPr>
+        <w:rPr>
+          <w:rFonts w:ascii="Times New Roman" w:hAnsi="Times New Roman" w:cs="Times New Roman"/>
+          <w:sz w:val="24"/>
+          <w:szCs w:val="24"/>
+        </w:rPr>
+      </w:pPr>
+      <w:r>
+        <w:rPr>
+          <w:rFonts w:ascii="Times New Roman" w:hAnsi="Times New Roman" w:cs="Times New Roman"/>
+          <w:sz w:val="24"/>
+          <w:szCs w:val="24"/>
+        </w:rPr>
+        <w:t>Validate historical market data.</w:t>
+      </w:r>
+    </w:p>
+    <w:p>
+      <w:pPr>
+        <w:pStyle w:val="ListParagraph"/>
+        <w:numPr>
+          <w:ilvl w:val="0"/>
+          <w:numId w:val="47"/>
+        </w:numPr>
+        <w:rPr>
+          <w:rFonts w:ascii="Times New Roman" w:hAnsi="Times New Roman" w:cs="Times New Roman"/>
+          <w:sz w:val="24"/>
+          <w:szCs w:val="24"/>
+        </w:rPr>
+      </w:pPr>
+      <w:r>
+        <w:rPr>
+          <w:rFonts w:ascii="Times New Roman" w:hAnsi="Times New Roman" w:cs="Times New Roman"/>
+          <w:sz w:val="24"/>
+          <w:szCs w:val="24"/>
+        </w:rPr>
+        <w:t>Ensure OHLC values are logically consistent.</w:t>
+      </w:r>
+    </w:p>
+    <w:p>
+      <w:pPr>
+        <w:pStyle w:val="ListParagraph"/>
+        <w:numPr>
+          <w:ilvl w:val="0"/>
+          <w:numId w:val="47"/>
+        </w:numPr>
+        <w:rPr>
+          <w:rFonts w:ascii="Times New Roman" w:hAnsi="Times New Roman" w:cs="Times New Roman"/>
+          <w:sz w:val="24"/>
+          <w:szCs w:val="24"/>
+        </w:rPr>
+      </w:pPr>
+      <w:r>
+        <w:rPr>
+          <w:rFonts w:ascii="Times New Roman" w:hAnsi="Times New Roman" w:cs="Times New Roman"/>
+          <w:sz w:val="24"/>
+          <w:szCs w:val="24"/>
+        </w:rPr>
+        <w:t xml:space="preserve">Validate </w:t>
+      </w:r>
+      <w:proofErr w:type="spellStart"/>
+      <w:r>
+        <w:rPr>
+          <w:rFonts w:ascii="Times New Roman" w:hAnsi="Times New Roman" w:cs="Times New Roman"/>
+          <w:sz w:val="24"/>
+          <w:szCs w:val="24"/>
+        </w:rPr>
+        <w:t>timezone</w:t>
+      </w:r>
+      <w:proofErr w:type="spellEnd"/>
+      <w:r>
+        <w:rPr>
+          <w:rFonts w:ascii="Times New Roman" w:hAnsi="Times New Roman" w:cs="Times New Roman"/>
+          <w:sz w:val="24"/>
+          <w:szCs w:val="24"/>
+        </w:rPr>
+        <w:t>-aware timestamps.</w:t>
+      </w:r>
+    </w:p>
+    <w:p>
+      <w:pPr>
+        <w:pStyle w:val="ListParagraph"/>
+        <w:numPr>
+          <w:ilvl w:val="0"/>
+          <w:numId w:val="47"/>
+        </w:numPr>
+        <w:rPr>
+          <w:rFonts w:ascii="Times New Roman" w:hAnsi="Times New Roman" w:cs="Times New Roman"/>
+          <w:sz w:val="24"/>
+          <w:szCs w:val="24"/>
+        </w:rPr>
+      </w:pPr>
+      <w:r>
+        <w:rPr>
+          <w:rFonts w:ascii="Times New Roman" w:hAnsi="Times New Roman" w:cs="Times New Roman"/>
+          <w:sz w:val="24"/>
+          <w:szCs w:val="24"/>
+        </w:rPr>
+        <w:t>Represent supported market intervals.</w:t>
+      </w:r>
+    </w:p>
+    <w:p>
+      <w:pPr>
+        <w:pStyle w:val="ListParagraph"/>
+        <w:numPr>
+          <w:ilvl w:val="0"/>
+          <w:numId w:val="47"/>
+        </w:numPr>
+        <w:rPr>
+          <w:rFonts w:ascii="Times New Roman" w:hAnsi="Times New Roman" w:cs="Times New Roman"/>
+          <w:sz w:val="24"/>
+          <w:szCs w:val="24"/>
+        </w:rPr>
+      </w:pPr>
+      <w:r>
+        <w:rPr>
+          <w:rFonts w:ascii="Times New Roman" w:hAnsi="Times New Roman" w:cs="Times New Roman"/>
+          <w:sz w:val="24"/>
+          <w:szCs w:val="24"/>
+        </w:rPr>
+        <w:t>Provide a common data contract for provider integrations, database persistence, technical indicators and future AI components.</w:t>
+      </w:r>
+    </w:p>
+    <w:p>
+      <w:pPr>
+        <w:rPr>
+          <w:rFonts w:ascii="Times New Roman" w:hAnsi="Times New Roman" w:cs="Times New Roman"/>
+          <w:sz w:val="24"/>
+          <w:szCs w:val="24"/>
+        </w:rPr>
+      </w:pPr>
+      <w:r>
+        <w:rPr>
+          <w:rFonts w:ascii="Times New Roman" w:hAnsi="Times New Roman" w:cs="Times New Roman"/>
+          <w:sz w:val="24"/>
+          <w:szCs w:val="24"/>
+        </w:rPr>
+        <w:t>Design rationale</w:t>
+      </w:r>
+    </w:p>
+    <w:p>
+      <w:r>
+        <w:rPr>
+          <w:rFonts w:ascii="Times New Roman" w:hAnsi="Times New Roman" w:cs="Times New Roman"/>
+          <w:sz w:val="24"/>
+          <w:szCs w:val="24"/>
+        </w:rPr>
+        <w:t>Historical providers should return validated domain models rather than provider-specific JSON structures. This ensures that all downstream components operate on a consistent representation regardless of whether the data originates from Yahoo Finance, Twelve Data, or another provider.</w:t>
+      </w:r>
       <w:r>
         <w:pict>
-          <v:rect id="_x0000_i1117" style="width:0;height:1.5pt" o:hralign="center" o:hrstd="t" o:hr="t" fillcolor="#a0a0a0" stroked="f"/>
+          <v:rect id="_x0000_i1033" style="width:0;height:1.5pt" o:hralign="center" o:hrstd="t" o:hr="t" fillcolor="#a0a0a0" stroked="f"/>
         </w:pict>
       </w:r>
     </w:p>
@@ -4894,16 +5181,538 @@
         <w:pStyle w:val="Heading1"/>
       </w:pPr>
       <w:r>
+        <w:t>9. Provider Selection</w:t>
+      </w:r>
+    </w:p>
+    <w:p>
+      <w:pPr>
+        <w:pStyle w:val="NormalWeb"/>
+      </w:pPr>
+      <w:r>
+        <w:t>The configured provider is selected through:</w:t>
+      </w:r>
+    </w:p>
+    <w:p>
+      <w:pPr>
+        <w:pStyle w:val="HTMLPreformatted"/>
+        <w:rPr>
+          <w:rStyle w:val="HTMLCode"/>
+        </w:rPr>
+      </w:pPr>
+      <w:r>
+        <w:rPr>
+          <w:rStyle w:val="HTMLCode"/>
+        </w:rPr>
+        <w:t>MARKET_PROVIDER=mock</w:t>
+      </w:r>
+    </w:p>
+    <w:p>
+      <w:pPr>
+        <w:pStyle w:val="NormalWeb"/>
+      </w:pPr>
+      <w:r>
+        <w:t>or:</w:t>
+      </w:r>
+    </w:p>
+    <w:p>
+      <w:pPr>
+        <w:pStyle w:val="HTMLPreformatted"/>
+        <w:rPr>
+          <w:rStyle w:val="HTMLCode"/>
+        </w:rPr>
+      </w:pPr>
+      <w:r>
+        <w:rPr>
+          <w:rStyle w:val="HTMLCode"/>
+        </w:rPr>
+        <w:t>MARKET_PROVIDER=yahoo</w:t>
+      </w:r>
+    </w:p>
+    <w:p>
+      <w:pPr>
+        <w:pStyle w:val="NormalWeb"/>
+      </w:pPr>
+      <w:r>
+        <w:t>or:</w:t>
+      </w:r>
+    </w:p>
+    <w:p>
+      <w:pPr>
+        <w:pStyle w:val="HTMLPreformatted"/>
+        <w:rPr>
+          <w:rStyle w:val="HTMLCode"/>
+        </w:rPr>
+      </w:pPr>
+      <w:r>
+        <w:rPr>
+          <w:rStyle w:val="HTMLCode"/>
+        </w:rPr>
+        <w:t>MARKET_PROVIDER=</w:t>
+      </w:r>
+      <w:proofErr w:type="spellStart"/>
+      <w:r>
+        <w:rPr>
+          <w:rStyle w:val="HTMLCode"/>
+        </w:rPr>
+        <w:t>twelve_data</w:t>
+      </w:r>
+      <w:proofErr w:type="spellEnd"/>
+    </w:p>
+    <w:p>
+      <w:pPr>
+        <w:pStyle w:val="HTMLPreformatted"/>
+        <w:rPr>
+          <w:rStyle w:val="HTMLCode"/>
+        </w:rPr>
+      </w:pPr>
+    </w:p>
+    <w:p>
+      <w:pPr>
+        <w:pStyle w:val="NormalWeb"/>
+      </w:pPr>
+      <w:r>
+        <w:t>The provider factory converts the configuration value into the required implementation.</w:t>
+      </w:r>
+    </w:p>
+    <w:p>
+      <w:pPr>
+        <w:pStyle w:val="NormalWeb"/>
+      </w:pPr>
+      <w:r>
         <w:lastRenderedPageBreak/>
-        <w:t>9. Provider Selection</w:t>
-      </w:r>
-    </w:p>
-    <w:p>
-      <w:pPr>
-        <w:pStyle w:val="NormalWeb"/>
-      </w:pPr>
-      <w:r>
-        <w:t>The configured provider is selected through:</w:t>
+        <w:t>Current supported values:</w:t>
+      </w:r>
+    </w:p>
+    <w:p>
+      <w:pPr>
+        <w:pStyle w:val="NormalWeb"/>
+        <w:numPr>
+          <w:ilvl w:val="0"/>
+          <w:numId w:val="20"/>
+        </w:numPr>
+      </w:pPr>
+      <w:r>
+        <w:rPr>
+          <w:rStyle w:val="HTMLCode"/>
+        </w:rPr>
+        <w:t>mock</w:t>
+      </w:r>
+    </w:p>
+    <w:p>
+      <w:pPr>
+        <w:pStyle w:val="NormalWeb"/>
+        <w:numPr>
+          <w:ilvl w:val="0"/>
+          <w:numId w:val="20"/>
+        </w:numPr>
+      </w:pPr>
+      <w:r>
+        <w:rPr>
+          <w:rStyle w:val="HTMLCode"/>
+        </w:rPr>
+        <w:t>yahoo</w:t>
+      </w:r>
+    </w:p>
+    <w:p>
+      <w:pPr>
+        <w:pStyle w:val="NormalWeb"/>
+      </w:pPr>
+      <w:r>
+        <w:t>Unsupported values raise a clear configuration error.</w:t>
+      </w:r>
+    </w:p>
+    <w:p>
+      <w:pPr>
+        <w:pStyle w:val="NormalWeb"/>
+      </w:pPr>
+      <w:r>
+        <w:t>The simple conditional factory is intentional at the current scale.</w:t>
+      </w:r>
+    </w:p>
+    <w:p>
+      <w:pPr>
+        <w:pStyle w:val="NormalWeb"/>
+      </w:pPr>
+      <w:r>
+        <w:t>A registry-based factory may be introduced when the number of providers justifies the refactor.</w:t>
+      </w:r>
+    </w:p>
+    <w:p>
+      <w:r>
+        <w:pict>
+          <v:rect id="_x0000_i1034" style="width:0;height:1.5pt" o:hralign="center" o:hrstd="t" o:hr="t" fillcolor="#a0a0a0" stroked="f"/>
+        </w:pict>
+      </w:r>
+    </w:p>
+    <w:p>
+      <w:pPr>
+        <w:pStyle w:val="Heading1"/>
+      </w:pPr>
+      <w:r>
+        <w:t>10. Testing Strategy</w:t>
+      </w:r>
+    </w:p>
+    <w:p>
+      <w:pPr>
+        <w:pStyle w:val="Heading2"/>
+      </w:pPr>
+      <w:r>
+        <w:t>10.1 Current test coverage</w:t>
+      </w:r>
+    </w:p>
+    <w:p>
+      <w:pPr>
+        <w:pStyle w:val="NormalWeb"/>
+      </w:pPr>
+      <w:r>
+        <w:t>The</w:t>
+      </w:r>
+      <w:r>
+        <w:t xml:space="preserve"> backend currently contains 18</w:t>
+      </w:r>
+      <w:r>
+        <w:t xml:space="preserve"> passing automated tests.</w:t>
+      </w:r>
+    </w:p>
+    <w:p>
+      <w:pPr>
+        <w:pStyle w:val="NormalWeb"/>
+      </w:pPr>
+      <w:r>
+        <w:t>They cover:</w:t>
+      </w:r>
+    </w:p>
+    <w:p>
+      <w:pPr>
+        <w:pStyle w:val="NormalWeb"/>
+        <w:numPr>
+          <w:ilvl w:val="0"/>
+          <w:numId w:val="21"/>
+        </w:numPr>
+      </w:pPr>
+      <w:r>
+        <w:t>application configuration</w:t>
+      </w:r>
+    </w:p>
+    <w:p>
+      <w:pPr>
+        <w:pStyle w:val="NormalWeb"/>
+        <w:numPr>
+          <w:ilvl w:val="0"/>
+          <w:numId w:val="21"/>
+        </w:numPr>
+      </w:pPr>
+      <w:r>
+        <w:t>health endpoint behaviour</w:t>
+      </w:r>
+    </w:p>
+    <w:p>
+      <w:pPr>
+        <w:pStyle w:val="NormalWeb"/>
+        <w:numPr>
+          <w:ilvl w:val="0"/>
+          <w:numId w:val="21"/>
+        </w:numPr>
+      </w:pPr>
+      <w:r>
+        <w:t>market endpoint behaviour</w:t>
+      </w:r>
+    </w:p>
+    <w:p>
+      <w:pPr>
+        <w:pStyle w:val="NormalWeb"/>
+        <w:numPr>
+          <w:ilvl w:val="0"/>
+          <w:numId w:val="21"/>
+        </w:numPr>
+      </w:pPr>
+      <w:r>
+        <w:t>market response schema</w:t>
+      </w:r>
+    </w:p>
+    <w:p>
+      <w:pPr>
+        <w:pStyle w:val="NormalWeb"/>
+        <w:numPr>
+          <w:ilvl w:val="0"/>
+          <w:numId w:val="21"/>
+        </w:numPr>
+      </w:pPr>
+      <w:r>
+        <w:t>service delegation</w:t>
+      </w:r>
+    </w:p>
+    <w:p>
+      <w:pPr>
+        <w:pStyle w:val="NormalWeb"/>
+        <w:numPr>
+          <w:ilvl w:val="0"/>
+          <w:numId w:val="21"/>
+        </w:numPr>
+      </w:pPr>
+      <w:r>
+        <w:t>provider factory selection</w:t>
+      </w:r>
+    </w:p>
+    <w:p>
+      <w:pPr>
+        <w:pStyle w:val="NormalWeb"/>
+        <w:numPr>
+          <w:ilvl w:val="0"/>
+          <w:numId w:val="21"/>
+        </w:numPr>
+      </w:pPr>
+      <w:r>
+        <w:t>case-insensitive provider configuration</w:t>
+      </w:r>
+    </w:p>
+    <w:p>
+      <w:pPr>
+        <w:pStyle w:val="NormalWeb"/>
+        <w:numPr>
+          <w:ilvl w:val="0"/>
+          <w:numId w:val="21"/>
+        </w:numPr>
+      </w:pPr>
+      <w:r>
+        <w:t>unsupported-provider handling</w:t>
+      </w:r>
+    </w:p>
+    <w:p>
+      <w:pPr>
+        <w:pStyle w:val="NormalWeb"/>
+        <w:numPr>
+          <w:ilvl w:val="0"/>
+          <w:numId w:val="21"/>
+        </w:numPr>
+      </w:pPr>
+      <w:r>
+        <w:t>Yahoo Finance response transformation</w:t>
+      </w:r>
+    </w:p>
+    <w:p>
+      <w:pPr>
+        <w:pStyle w:val="NormalWeb"/>
+        <w:numPr>
+          <w:ilvl w:val="0"/>
+          <w:numId w:val="21"/>
+        </w:numPr>
+      </w:pPr>
+      <w:r>
+        <w:t>Yahoo Finance empty-response handling</w:t>
+      </w:r>
+    </w:p>
+    <w:p>
+      <w:pPr>
+        <w:pStyle w:val="NormalWeb"/>
+        <w:numPr>
+          <w:ilvl w:val="0"/>
+          <w:numId w:val="21"/>
+        </w:numPr>
+      </w:pPr>
+      <w:r>
+        <w:t xml:space="preserve">Twelve Data provider validation </w:t>
+      </w:r>
+    </w:p>
+    <w:p>
+      <w:pPr>
+        <w:pStyle w:val="NormalWeb"/>
+        <w:numPr>
+          <w:ilvl w:val="0"/>
+          <w:numId w:val="21"/>
+        </w:numPr>
+      </w:pPr>
+      <w:r>
+        <w:t xml:space="preserve">Dependency Injection </w:t>
+      </w:r>
+    </w:p>
+    <w:p>
+      <w:pPr>
+        <w:pStyle w:val="NormalWeb"/>
+        <w:numPr>
+          <w:ilvl w:val="0"/>
+          <w:numId w:val="21"/>
+        </w:numPr>
+      </w:pPr>
+      <w:r>
+        <w:t xml:space="preserve">Spot endpoint </w:t>
+      </w:r>
+    </w:p>
+    <w:p>
+      <w:pPr>
+        <w:pStyle w:val="NormalWeb"/>
+        <w:numPr>
+          <w:ilvl w:val="0"/>
+          <w:numId w:val="21"/>
+        </w:numPr>
+      </w:pPr>
+      <w:r>
+        <w:t>Futures endpoint</w:t>
+      </w:r>
+    </w:p>
+    <w:p>
+      <w:pPr>
+        <w:pStyle w:val="Heading2"/>
+      </w:pPr>
+      <w:r>
+        <w:t>10.2 Test categories</w:t>
+      </w:r>
+    </w:p>
+    <w:p>
+      <w:pPr>
+        <w:pStyle w:val="Heading3"/>
+      </w:pPr>
+      <w:r>
+        <w:t>Unit tests</w:t>
+      </w:r>
+    </w:p>
+    <w:p>
+      <w:pPr>
+        <w:pStyle w:val="NormalWeb"/>
+      </w:pPr>
+      <w:r>
+        <w:t>Used for:</w:t>
+      </w:r>
+    </w:p>
+    <w:p>
+      <w:pPr>
+        <w:pStyle w:val="NormalWeb"/>
+        <w:numPr>
+          <w:ilvl w:val="0"/>
+          <w:numId w:val="22"/>
+        </w:numPr>
+      </w:pPr>
+      <w:r>
+        <w:t>schemas</w:t>
+      </w:r>
+    </w:p>
+    <w:p>
+      <w:pPr>
+        <w:pStyle w:val="NormalWeb"/>
+        <w:numPr>
+          <w:ilvl w:val="0"/>
+          <w:numId w:val="22"/>
+        </w:numPr>
+      </w:pPr>
+      <w:r>
+        <w:t>service behaviour</w:t>
+      </w:r>
+    </w:p>
+    <w:p>
+      <w:pPr>
+        <w:pStyle w:val="NormalWeb"/>
+        <w:numPr>
+          <w:ilvl w:val="0"/>
+          <w:numId w:val="22"/>
+        </w:numPr>
+      </w:pPr>
+      <w:r>
+        <w:t>provider factories</w:t>
+      </w:r>
+    </w:p>
+    <w:p>
+      <w:pPr>
+        <w:pStyle w:val="NormalWeb"/>
+        <w:numPr>
+          <w:ilvl w:val="0"/>
+          <w:numId w:val="22"/>
+        </w:numPr>
+      </w:pPr>
+      <w:r>
+        <w:t>provider transformation logic</w:t>
+      </w:r>
+    </w:p>
+    <w:p>
+      <w:pPr>
+        <w:pStyle w:val="Heading3"/>
+      </w:pPr>
+      <w:r>
+        <w:lastRenderedPageBreak/>
+        <w:t>API tests</w:t>
+      </w:r>
+    </w:p>
+    <w:p>
+      <w:pPr>
+        <w:pStyle w:val="NormalWeb"/>
+      </w:pPr>
+      <w:r>
+        <w:t>Used for:</w:t>
+      </w:r>
+    </w:p>
+    <w:p>
+      <w:pPr>
+        <w:pStyle w:val="NormalWeb"/>
+        <w:numPr>
+          <w:ilvl w:val="0"/>
+          <w:numId w:val="23"/>
+        </w:numPr>
+      </w:pPr>
+      <w:r>
+        <w:t>HTTP status codes</w:t>
+      </w:r>
+    </w:p>
+    <w:p>
+      <w:pPr>
+        <w:pStyle w:val="NormalWeb"/>
+        <w:numPr>
+          <w:ilvl w:val="0"/>
+          <w:numId w:val="23"/>
+        </w:numPr>
+      </w:pPr>
+      <w:r>
+        <w:t>endpoint response contracts</w:t>
+      </w:r>
+    </w:p>
+    <w:p>
+      <w:pPr>
+        <w:pStyle w:val="NormalWeb"/>
+        <w:numPr>
+          <w:ilvl w:val="0"/>
+          <w:numId w:val="23"/>
+        </w:numPr>
+      </w:pPr>
+      <w:r>
+        <w:t>router registration</w:t>
+      </w:r>
+    </w:p>
+    <w:p>
+      <w:pPr>
+        <w:pStyle w:val="Heading3"/>
+      </w:pPr>
+      <w:r>
+        <w:t>External integration tests</w:t>
+      </w:r>
+    </w:p>
+    <w:p>
+      <w:pPr>
+        <w:pStyle w:val="NormalWeb"/>
+      </w:pPr>
+      <w:r>
+        <w:t>Live-provider checks are currently manual.</w:t>
+      </w:r>
+    </w:p>
+    <w:p>
+      <w:pPr>
+        <w:pStyle w:val="NormalWeb"/>
+      </w:pPr>
+      <w:r>
+        <w:t>They are not part of the default test suite because they depend on network availability and live third-party behaviour.</w:t>
+      </w:r>
+    </w:p>
+    <w:p>
+      <w:pPr>
+        <w:pStyle w:val="Heading2"/>
+      </w:pPr>
+      <w:r>
+        <w:t>10.3 Test execution</w:t>
+      </w:r>
+    </w:p>
+    <w:p>
+      <w:pPr>
+        <w:pStyle w:val="NormalWeb"/>
+      </w:pPr>
+      <w:r>
+        <w:t>The standard command is:</w:t>
       </w:r>
     </w:p>
     <w:p>
@@ -4917,694 +5726,171 @@
         <w:rPr>
           <w:rStyle w:val="HTMLCode"/>
         </w:rPr>
-        <w:t>MARKET_PROVIDER=mock</w:t>
-      </w:r>
-    </w:p>
-    <w:p>
-      <w:pPr>
-        <w:pStyle w:val="NormalWeb"/>
-      </w:pPr>
-      <w:r>
-        <w:t>or:</w:t>
-      </w:r>
-    </w:p>
-    <w:p>
-      <w:pPr>
-        <w:pStyle w:val="HTMLPreformatted"/>
-        <w:rPr>
-          <w:rStyle w:val="HTMLCode"/>
-        </w:rPr>
-      </w:pPr>
-      <w:r>
-        <w:rPr>
-          <w:rStyle w:val="HTMLCode"/>
-        </w:rPr>
-        <w:t>MARKET_PROVIDER=yahoo</w:t>
-      </w:r>
-    </w:p>
-    <w:p>
-      <w:pPr>
-        <w:pStyle w:val="NormalWeb"/>
-      </w:pPr>
-      <w:r>
-        <w:t>or:</w:t>
-      </w:r>
-    </w:p>
-    <w:p>
-      <w:pPr>
-        <w:pStyle w:val="HTMLPreformatted"/>
-        <w:rPr>
-          <w:rStyle w:val="HTMLCode"/>
-        </w:rPr>
-      </w:pPr>
-      <w:r>
-        <w:rPr>
-          <w:rStyle w:val="HTMLCode"/>
-        </w:rPr>
-        <w:t>MARKET_PROVIDER=</w:t>
+        <w:t xml:space="preserve">python -m </w:t>
       </w:r>
       <w:proofErr w:type="spellStart"/>
       <w:r>
         <w:rPr>
           <w:rStyle w:val="HTMLCode"/>
         </w:rPr>
-        <w:t>twelve_data</w:t>
+        <w:t>pytest</w:t>
       </w:r>
       <w:proofErr w:type="spellEnd"/>
     </w:p>
     <w:p>
       <w:pPr>
-        <w:pStyle w:val="HTMLPreformatted"/>
-        <w:rPr>
-          <w:rStyle w:val="HTMLCode"/>
-        </w:rPr>
-      </w:pPr>
-    </w:p>
-    <w:p>
-      <w:pPr>
-        <w:pStyle w:val="NormalWeb"/>
-      </w:pPr>
-      <w:r>
-        <w:t>The provider factory converts the configuration value into the required implementation.</w:t>
-      </w:r>
-    </w:p>
-    <w:p>
-      <w:pPr>
-        <w:pStyle w:val="NormalWeb"/>
-      </w:pPr>
-      <w:r>
-        <w:t>Current supported values:</w:t>
-      </w:r>
-    </w:p>
-    <w:p>
-      <w:pPr>
-        <w:pStyle w:val="NormalWeb"/>
-        <w:numPr>
-          <w:ilvl w:val="0"/>
-          <w:numId w:val="20"/>
-        </w:numPr>
-      </w:pPr>
-      <w:r>
-        <w:rPr>
-          <w:rStyle w:val="HTMLCode"/>
-        </w:rPr>
-        <w:t>mock</w:t>
-      </w:r>
-    </w:p>
-    <w:p>
-      <w:pPr>
-        <w:pStyle w:val="NormalWeb"/>
-        <w:numPr>
-          <w:ilvl w:val="0"/>
-          <w:numId w:val="20"/>
-        </w:numPr>
-      </w:pPr>
-      <w:r>
-        <w:rPr>
-          <w:rStyle w:val="HTMLCode"/>
-        </w:rPr>
-        <w:t>yahoo</w:t>
-      </w:r>
-    </w:p>
-    <w:p>
-      <w:pPr>
-        <w:pStyle w:val="NormalWeb"/>
-      </w:pPr>
-      <w:r>
-        <w:t>Unsupported values raise a clear configuration error.</w:t>
-      </w:r>
-    </w:p>
-    <w:p>
-      <w:pPr>
-        <w:pStyle w:val="NormalWeb"/>
-      </w:pPr>
-      <w:r>
-        <w:t>The simple conditional factory is intentional at the current scale.</w:t>
-      </w:r>
-    </w:p>
-    <w:p>
-      <w:pPr>
-        <w:pStyle w:val="NormalWeb"/>
-      </w:pPr>
-      <w:r>
-        <w:t>A registry-based factory may be introduced when the number of providers justifies the refactor.</w:t>
+        <w:pStyle w:val="NormalWeb"/>
+      </w:pPr>
+      <w:r>
+        <w:t xml:space="preserve">This ensures </w:t>
+      </w:r>
+      <w:proofErr w:type="spellStart"/>
+      <w:r>
+        <w:t>pytest</w:t>
+      </w:r>
+      <w:proofErr w:type="spellEnd"/>
+      <w:r>
+        <w:t xml:space="preserve"> runs using the active project Python interpreter.</w:t>
+      </w:r>
+    </w:p>
+    <w:p>
+      <w:pPr>
+        <w:pStyle w:val="Heading2"/>
+      </w:pPr>
+      <w:r>
+        <w:t>10.4 Future test categories</w:t>
+      </w:r>
+    </w:p>
+    <w:p>
+      <w:pPr>
+        <w:pStyle w:val="NormalWeb"/>
+      </w:pPr>
+      <w:r>
+        <w:t>Later epics will introduce:</w:t>
+      </w:r>
+    </w:p>
+    <w:p>
+      <w:pPr>
+        <w:pStyle w:val="NormalWeb"/>
+        <w:numPr>
+          <w:ilvl w:val="0"/>
+          <w:numId w:val="24"/>
+        </w:numPr>
+      </w:pPr>
+      <w:r>
+        <w:t>database integration tests</w:t>
+      </w:r>
+    </w:p>
+    <w:p>
+      <w:pPr>
+        <w:pStyle w:val="NormalWeb"/>
+        <w:numPr>
+          <w:ilvl w:val="0"/>
+          <w:numId w:val="24"/>
+        </w:numPr>
+      </w:pPr>
+      <w:r>
+        <w:t>repository tests</w:t>
+      </w:r>
+    </w:p>
+    <w:p>
+      <w:pPr>
+        <w:pStyle w:val="NormalWeb"/>
+        <w:numPr>
+          <w:ilvl w:val="0"/>
+          <w:numId w:val="24"/>
+        </w:numPr>
+      </w:pPr>
+      <w:r>
+        <w:t>ingestion job tests</w:t>
+      </w:r>
+    </w:p>
+    <w:p>
+      <w:pPr>
+        <w:pStyle w:val="NormalWeb"/>
+        <w:numPr>
+          <w:ilvl w:val="0"/>
+          <w:numId w:val="24"/>
+        </w:numPr>
+      </w:pPr>
+      <w:proofErr w:type="spellStart"/>
+      <w:r>
+        <w:t>Redis</w:t>
+      </w:r>
+      <w:proofErr w:type="spellEnd"/>
+      <w:r>
+        <w:t xml:space="preserve"> cache tests</w:t>
+      </w:r>
+    </w:p>
+    <w:p>
+      <w:pPr>
+        <w:pStyle w:val="NormalWeb"/>
+        <w:numPr>
+          <w:ilvl w:val="0"/>
+          <w:numId w:val="24"/>
+        </w:numPr>
+      </w:pPr>
+      <w:r>
+        <w:t>time-alignment tests</w:t>
+      </w:r>
+    </w:p>
+    <w:p>
+      <w:pPr>
+        <w:pStyle w:val="NormalWeb"/>
+        <w:numPr>
+          <w:ilvl w:val="0"/>
+          <w:numId w:val="24"/>
+        </w:numPr>
+      </w:pPr>
+      <w:r>
+        <w:t>technical indicator tests</w:t>
+      </w:r>
+    </w:p>
+    <w:p>
+      <w:pPr>
+        <w:pStyle w:val="NormalWeb"/>
+        <w:numPr>
+          <w:ilvl w:val="0"/>
+          <w:numId w:val="24"/>
+        </w:numPr>
+      </w:pPr>
+      <w:proofErr w:type="spellStart"/>
+      <w:r>
+        <w:t>FinBERT</w:t>
+      </w:r>
+      <w:proofErr w:type="spellEnd"/>
+      <w:r>
+        <w:t xml:space="preserve"> evaluation tests</w:t>
+      </w:r>
+    </w:p>
+    <w:p>
+      <w:pPr>
+        <w:pStyle w:val="NormalWeb"/>
+        <w:numPr>
+          <w:ilvl w:val="0"/>
+          <w:numId w:val="24"/>
+        </w:numPr>
+      </w:pPr>
+      <w:r>
+        <w:t>frontend component tests</w:t>
+      </w:r>
+    </w:p>
+    <w:p>
+      <w:pPr>
+        <w:pStyle w:val="NormalWeb"/>
+        <w:numPr>
+          <w:ilvl w:val="0"/>
+          <w:numId w:val="24"/>
+        </w:numPr>
+      </w:pPr>
+      <w:r>
+        <w:t>end-to-end tests</w:t>
       </w:r>
     </w:p>
     <w:p>
       <w:r>
         <w:pict>
-          <v:rect id="_x0000_i1118" style="width:0;height:1.5pt" o:hralign="center" o:hrstd="t" o:hr="t" fillcolor="#a0a0a0" stroked="f"/>
-        </w:pict>
-      </w:r>
-    </w:p>
-    <w:p>
-      <w:pPr>
-        <w:pStyle w:val="Heading1"/>
-      </w:pPr>
-      <w:r>
-        <w:t>10. Testing Strategy</w:t>
-      </w:r>
-    </w:p>
-    <w:p>
-      <w:pPr>
-        <w:pStyle w:val="Heading2"/>
-      </w:pPr>
-      <w:r>
-        <w:t>10.1 Current test coverage</w:t>
-      </w:r>
-    </w:p>
-    <w:p>
-      <w:pPr>
-        <w:pStyle w:val="NormalWeb"/>
-      </w:pPr>
-      <w:r>
-        <w:t>The</w:t>
-      </w:r>
-      <w:r>
-        <w:t xml:space="preserve"> backend currently contains 18</w:t>
-      </w:r>
-      <w:r>
-        <w:t xml:space="preserve"> passing automated tests.</w:t>
-      </w:r>
-    </w:p>
-    <w:p>
-      <w:pPr>
-        <w:pStyle w:val="NormalWeb"/>
-      </w:pPr>
-      <w:r>
-        <w:t>They cover:</w:t>
-      </w:r>
-    </w:p>
-    <w:p>
-      <w:pPr>
-        <w:pStyle w:val="NormalWeb"/>
-        <w:numPr>
-          <w:ilvl w:val="0"/>
-          <w:numId w:val="21"/>
-        </w:numPr>
-      </w:pPr>
-      <w:r>
-        <w:t>application configuration</w:t>
-      </w:r>
-    </w:p>
-    <w:p>
-      <w:pPr>
-        <w:pStyle w:val="NormalWeb"/>
-        <w:numPr>
-          <w:ilvl w:val="0"/>
-          <w:numId w:val="21"/>
-        </w:numPr>
-      </w:pPr>
-      <w:r>
-        <w:t>health endpoint behaviour</w:t>
-      </w:r>
-    </w:p>
-    <w:p>
-      <w:pPr>
-        <w:pStyle w:val="NormalWeb"/>
-        <w:numPr>
-          <w:ilvl w:val="0"/>
-          <w:numId w:val="21"/>
-        </w:numPr>
-      </w:pPr>
-      <w:r>
-        <w:t>market endpoint behaviour</w:t>
-      </w:r>
-    </w:p>
-    <w:p>
-      <w:pPr>
-        <w:pStyle w:val="NormalWeb"/>
-        <w:numPr>
-          <w:ilvl w:val="0"/>
-          <w:numId w:val="21"/>
-        </w:numPr>
-      </w:pPr>
-      <w:r>
-        <w:t>market response schema</w:t>
-      </w:r>
-    </w:p>
-    <w:p>
-      <w:pPr>
-        <w:pStyle w:val="NormalWeb"/>
-        <w:numPr>
-          <w:ilvl w:val="0"/>
-          <w:numId w:val="21"/>
-        </w:numPr>
-      </w:pPr>
-      <w:r>
-        <w:t>service delegation</w:t>
-      </w:r>
-    </w:p>
-    <w:p>
-      <w:pPr>
-        <w:pStyle w:val="NormalWeb"/>
-        <w:numPr>
-          <w:ilvl w:val="0"/>
-          <w:numId w:val="21"/>
-        </w:numPr>
-      </w:pPr>
-      <w:r>
-        <w:t>provider factory selection</w:t>
-      </w:r>
-    </w:p>
-    <w:p>
-      <w:pPr>
-        <w:pStyle w:val="NormalWeb"/>
-        <w:numPr>
-          <w:ilvl w:val="0"/>
-          <w:numId w:val="21"/>
-        </w:numPr>
-      </w:pPr>
-      <w:r>
-        <w:t>case-insensitive provider configuration</w:t>
-      </w:r>
-    </w:p>
-    <w:p>
-      <w:pPr>
-        <w:pStyle w:val="NormalWeb"/>
-        <w:numPr>
-          <w:ilvl w:val="0"/>
-          <w:numId w:val="21"/>
-        </w:numPr>
-      </w:pPr>
-      <w:r>
-        <w:t>unsupported-provider handling</w:t>
-      </w:r>
-    </w:p>
-    <w:p>
-      <w:pPr>
-        <w:pStyle w:val="NormalWeb"/>
-        <w:numPr>
-          <w:ilvl w:val="0"/>
-          <w:numId w:val="21"/>
-        </w:numPr>
-      </w:pPr>
-      <w:r>
-        <w:t>Yahoo Finance response transformation</w:t>
-      </w:r>
-    </w:p>
-    <w:p>
-      <w:pPr>
-        <w:pStyle w:val="NormalWeb"/>
-        <w:numPr>
-          <w:ilvl w:val="0"/>
-          <w:numId w:val="21"/>
-        </w:numPr>
-      </w:pPr>
-      <w:r>
-        <w:lastRenderedPageBreak/>
-        <w:t>Yahoo Finance empty-response handling</w:t>
-      </w:r>
-    </w:p>
-    <w:p>
-      <w:pPr>
-        <w:pStyle w:val="NormalWeb"/>
-        <w:numPr>
-          <w:ilvl w:val="0"/>
-          <w:numId w:val="21"/>
-        </w:numPr>
-      </w:pPr>
-      <w:r>
-        <w:t xml:space="preserve">Twelve Data provider validation </w:t>
-      </w:r>
-    </w:p>
-    <w:p>
-      <w:pPr>
-        <w:pStyle w:val="NormalWeb"/>
-        <w:numPr>
-          <w:ilvl w:val="0"/>
-          <w:numId w:val="21"/>
-        </w:numPr>
-      </w:pPr>
-      <w:r>
-        <w:t xml:space="preserve">Dependency Injection </w:t>
-      </w:r>
-    </w:p>
-    <w:p>
-      <w:pPr>
-        <w:pStyle w:val="NormalWeb"/>
-        <w:numPr>
-          <w:ilvl w:val="0"/>
-          <w:numId w:val="21"/>
-        </w:numPr>
-      </w:pPr>
-      <w:r>
-        <w:t xml:space="preserve">Spot endpoint </w:t>
-      </w:r>
-    </w:p>
-    <w:p>
-      <w:pPr>
-        <w:pStyle w:val="NormalWeb"/>
-        <w:numPr>
-          <w:ilvl w:val="0"/>
-          <w:numId w:val="21"/>
-        </w:numPr>
-      </w:pPr>
-      <w:r>
-        <w:t>Futures endpoint</w:t>
-      </w:r>
-    </w:p>
-    <w:p>
-      <w:pPr>
-        <w:pStyle w:val="Heading2"/>
-      </w:pPr>
-      <w:r>
-        <w:t>10.2 Test categories</w:t>
-      </w:r>
-    </w:p>
-    <w:p>
-      <w:pPr>
-        <w:pStyle w:val="Heading3"/>
-      </w:pPr>
-      <w:r>
-        <w:t>Unit tests</w:t>
-      </w:r>
-    </w:p>
-    <w:p>
-      <w:pPr>
-        <w:pStyle w:val="NormalWeb"/>
-      </w:pPr>
-      <w:r>
-        <w:t>Used for:</w:t>
-      </w:r>
-    </w:p>
-    <w:p>
-      <w:pPr>
-        <w:pStyle w:val="NormalWeb"/>
-        <w:numPr>
-          <w:ilvl w:val="0"/>
-          <w:numId w:val="22"/>
-        </w:numPr>
-      </w:pPr>
-      <w:r>
-        <w:t>schemas</w:t>
-      </w:r>
-    </w:p>
-    <w:p>
-      <w:pPr>
-        <w:pStyle w:val="NormalWeb"/>
-        <w:numPr>
-          <w:ilvl w:val="0"/>
-          <w:numId w:val="22"/>
-        </w:numPr>
-      </w:pPr>
-      <w:r>
-        <w:t>service behaviour</w:t>
-      </w:r>
-    </w:p>
-    <w:p>
-      <w:pPr>
-        <w:pStyle w:val="NormalWeb"/>
-        <w:numPr>
-          <w:ilvl w:val="0"/>
-          <w:numId w:val="22"/>
-        </w:numPr>
-      </w:pPr>
-      <w:r>
-        <w:t>provider factories</w:t>
-      </w:r>
-    </w:p>
-    <w:p>
-      <w:pPr>
-        <w:pStyle w:val="NormalWeb"/>
-        <w:numPr>
-          <w:ilvl w:val="0"/>
-          <w:numId w:val="22"/>
-        </w:numPr>
-      </w:pPr>
-      <w:r>
-        <w:t>provider transformation logic</w:t>
-      </w:r>
-    </w:p>
-    <w:p>
-      <w:pPr>
-        <w:pStyle w:val="Heading3"/>
-      </w:pPr>
-      <w:r>
-        <w:t>API tests</w:t>
-      </w:r>
-    </w:p>
-    <w:p>
-      <w:pPr>
-        <w:pStyle w:val="NormalWeb"/>
-      </w:pPr>
-      <w:r>
-        <w:t>Used for:</w:t>
-      </w:r>
-    </w:p>
-    <w:p>
-      <w:pPr>
-        <w:pStyle w:val="NormalWeb"/>
-        <w:numPr>
-          <w:ilvl w:val="0"/>
-          <w:numId w:val="23"/>
-        </w:numPr>
-      </w:pPr>
-      <w:r>
-        <w:t>HTTP status codes</w:t>
-      </w:r>
-    </w:p>
-    <w:p>
-      <w:pPr>
-        <w:pStyle w:val="NormalWeb"/>
-        <w:numPr>
-          <w:ilvl w:val="0"/>
-          <w:numId w:val="23"/>
-        </w:numPr>
-      </w:pPr>
-      <w:r>
-        <w:t>endpoint response contracts</w:t>
-      </w:r>
-    </w:p>
-    <w:p>
-      <w:pPr>
-        <w:pStyle w:val="NormalWeb"/>
-        <w:numPr>
-          <w:ilvl w:val="0"/>
-          <w:numId w:val="23"/>
-        </w:numPr>
-      </w:pPr>
-      <w:r>
-        <w:t>router registration</w:t>
-      </w:r>
-    </w:p>
-    <w:p>
-      <w:pPr>
-        <w:pStyle w:val="Heading3"/>
-      </w:pPr>
-      <w:r>
-        <w:t>External integration tests</w:t>
-      </w:r>
-    </w:p>
-    <w:p>
-      <w:pPr>
-        <w:pStyle w:val="NormalWeb"/>
-      </w:pPr>
-      <w:r>
-        <w:t>Live-provider checks are currently manual.</w:t>
-      </w:r>
-    </w:p>
-    <w:p>
-      <w:pPr>
-        <w:pStyle w:val="NormalWeb"/>
-      </w:pPr>
-      <w:r>
-        <w:t>They are not part of the default test suite because they depend on network availability and live third-party behaviour.</w:t>
-      </w:r>
-    </w:p>
-    <w:p>
-      <w:pPr>
-        <w:pStyle w:val="Heading2"/>
-      </w:pPr>
-      <w:r>
-        <w:t>10.3 Test execution</w:t>
-      </w:r>
-    </w:p>
-    <w:p>
-      <w:pPr>
-        <w:pStyle w:val="NormalWeb"/>
-      </w:pPr>
-      <w:r>
-        <w:t>The standard command is:</w:t>
-      </w:r>
-    </w:p>
-    <w:p>
-      <w:pPr>
-        <w:pStyle w:val="HTMLPreformatted"/>
-        <w:rPr>
-          <w:rStyle w:val="HTMLCode"/>
-        </w:rPr>
-      </w:pPr>
-      <w:r>
-        <w:rPr>
-          <w:rStyle w:val="HTMLCode"/>
-        </w:rPr>
-        <w:t xml:space="preserve">python -m </w:t>
-      </w:r>
-      <w:proofErr w:type="spellStart"/>
-      <w:r>
-        <w:rPr>
-          <w:rStyle w:val="HTMLCode"/>
-        </w:rPr>
-        <w:t>pytest</w:t>
-      </w:r>
-      <w:proofErr w:type="spellEnd"/>
-    </w:p>
-    <w:p>
-      <w:pPr>
-        <w:pStyle w:val="NormalWeb"/>
-      </w:pPr>
-      <w:r>
-        <w:t xml:space="preserve">This ensures </w:t>
-      </w:r>
-      <w:proofErr w:type="spellStart"/>
-      <w:r>
-        <w:t>pytest</w:t>
-      </w:r>
-      <w:proofErr w:type="spellEnd"/>
-      <w:r>
-        <w:t xml:space="preserve"> runs using the active project Python interpreter.</w:t>
-      </w:r>
-    </w:p>
-    <w:p>
-      <w:pPr>
-        <w:pStyle w:val="Heading2"/>
-      </w:pPr>
-      <w:r>
-        <w:t>10.4 Future test categories</w:t>
-      </w:r>
-    </w:p>
-    <w:p>
-      <w:pPr>
-        <w:pStyle w:val="NormalWeb"/>
-      </w:pPr>
-      <w:r>
-        <w:t>Later epics will introduce:</w:t>
-      </w:r>
-    </w:p>
-    <w:p>
-      <w:pPr>
-        <w:pStyle w:val="NormalWeb"/>
-        <w:numPr>
-          <w:ilvl w:val="0"/>
-          <w:numId w:val="24"/>
-        </w:numPr>
-      </w:pPr>
-      <w:r>
-        <w:t>database integration tests</w:t>
-      </w:r>
-    </w:p>
-    <w:p>
-      <w:pPr>
-        <w:pStyle w:val="NormalWeb"/>
-        <w:numPr>
-          <w:ilvl w:val="0"/>
-          <w:numId w:val="24"/>
-        </w:numPr>
-      </w:pPr>
-      <w:r>
-        <w:t>repository tests</w:t>
-      </w:r>
-    </w:p>
-    <w:p>
-      <w:pPr>
-        <w:pStyle w:val="NormalWeb"/>
-        <w:numPr>
-          <w:ilvl w:val="0"/>
-          <w:numId w:val="24"/>
-        </w:numPr>
-      </w:pPr>
-      <w:r>
-        <w:t>ingestion job tests</w:t>
-      </w:r>
-    </w:p>
-    <w:p>
-      <w:pPr>
-        <w:pStyle w:val="NormalWeb"/>
-        <w:numPr>
-          <w:ilvl w:val="0"/>
-          <w:numId w:val="24"/>
-        </w:numPr>
-      </w:pPr>
-      <w:proofErr w:type="spellStart"/>
-      <w:r>
-        <w:t>Redis</w:t>
-      </w:r>
-      <w:proofErr w:type="spellEnd"/>
-      <w:r>
-        <w:t xml:space="preserve"> cache tests</w:t>
-      </w:r>
-    </w:p>
-    <w:p>
-      <w:pPr>
-        <w:pStyle w:val="NormalWeb"/>
-        <w:numPr>
-          <w:ilvl w:val="0"/>
-          <w:numId w:val="24"/>
-        </w:numPr>
-      </w:pPr>
-      <w:r>
-        <w:lastRenderedPageBreak/>
-        <w:t>time-alignment tests</w:t>
-      </w:r>
-    </w:p>
-    <w:p>
-      <w:pPr>
-        <w:pStyle w:val="NormalWeb"/>
-        <w:numPr>
-          <w:ilvl w:val="0"/>
-          <w:numId w:val="24"/>
-        </w:numPr>
-      </w:pPr>
-      <w:r>
-        <w:t>technical indicator tests</w:t>
-      </w:r>
-    </w:p>
-    <w:p>
-      <w:pPr>
-        <w:pStyle w:val="NormalWeb"/>
-        <w:numPr>
-          <w:ilvl w:val="0"/>
-          <w:numId w:val="24"/>
-        </w:numPr>
-      </w:pPr>
-      <w:proofErr w:type="spellStart"/>
-      <w:r>
-        <w:t>FinBERT</w:t>
-      </w:r>
-      <w:proofErr w:type="spellEnd"/>
-      <w:r>
-        <w:t xml:space="preserve"> evaluation tests</w:t>
-      </w:r>
-    </w:p>
-    <w:p>
-      <w:pPr>
-        <w:pStyle w:val="NormalWeb"/>
-        <w:numPr>
-          <w:ilvl w:val="0"/>
-          <w:numId w:val="24"/>
-        </w:numPr>
-      </w:pPr>
-      <w:r>
-        <w:t>frontend component tests</w:t>
-      </w:r>
-    </w:p>
-    <w:p>
-      <w:pPr>
-        <w:pStyle w:val="NormalWeb"/>
-        <w:numPr>
-          <w:ilvl w:val="0"/>
-          <w:numId w:val="24"/>
-        </w:numPr>
-      </w:pPr>
-      <w:r>
-        <w:t>end-to-end tests</w:t>
-      </w:r>
-    </w:p>
-    <w:p>
-      <w:r>
-        <w:pict>
-          <v:rect id="_x0000_i1119" style="width:0;height:1.5pt" o:hralign="center" o:hrstd="t" o:hr="t" fillcolor="#a0a0a0" stroked="f"/>
+          <v:rect id="_x0000_i1035" style="width:0;height:1.5pt" o:hralign="center" o:hrstd="t" o:hr="t" fillcolor="#a0a0a0" stroked="f"/>
         </w:pict>
       </w:r>
       <w:r>
@@ -6220,7 +6506,7 @@
     <w:p>
       <w:r>
         <w:pict>
-          <v:rect id="_x0000_i1120" style="width:0;height:1.5pt" o:hralign="center" o:hrstd="t" o:hr="t" fillcolor="#a0a0a0" stroked="f"/>
+          <v:rect id="_x0000_i1036" style="width:0;height:1.5pt" o:hralign="center" o:hrstd="t" o:hr="t" fillcolor="#a0a0a0" stroked="f"/>
         </w:pict>
       </w:r>
     </w:p>
@@ -6374,7 +6660,7 @@
       </w:r>
       <w:r>
         <w:pict>
-          <v:rect id="_x0000_i1121" style="width:0;height:1.5pt" o:hralign="center" o:hrstd="t" o:hr="t" fillcolor="#a0a0a0" stroked="f"/>
+          <v:rect id="_x0000_i1037" style="width:0;height:1.5pt" o:hralign="center" o:hrstd="t" o:hr="t" fillcolor="#a0a0a0" stroked="f"/>
         </w:pict>
       </w:r>
     </w:p>
@@ -6527,7 +6813,7 @@
     <w:p>
       <w:r>
         <w:pict>
-          <v:rect id="_x0000_i1122" style="width:0;height:1.5pt" o:hralign="center" o:hrstd="t" o:hr="t" fillcolor="#a0a0a0" stroked="f"/>
+          <v:rect id="_x0000_i1038" style="width:0;height:1.5pt" o:hralign="center" o:hrstd="t" o:hr="t" fillcolor="#a0a0a0" stroked="f"/>
         </w:pict>
       </w:r>
     </w:p>
@@ -6998,7 +7284,7 @@
     <w:p>
       <w:r>
         <w:pict>
-          <v:rect id="_x0000_i1123" style="width:0;height:1.5pt" o:hralign="center" o:hrstd="t" o:hr="t" fillcolor="#a0a0a0" stroked="f"/>
+          <v:rect id="_x0000_i1039" style="width:0;height:1.5pt" o:hralign="center" o:hrstd="t" o:hr="t" fillcolor="#a0a0a0" stroked="f"/>
         </w:pict>
       </w:r>
     </w:p>
@@ -7131,7 +7417,7 @@
     <w:p>
       <w:r>
         <w:pict>
-          <v:rect id="_x0000_i1124" style="width:0;height:1.5pt" o:hralign="center" o:hrstd="t" o:hr="t" fillcolor="#a0a0a0" stroked="f"/>
+          <v:rect id="_x0000_i1040" style="width:0;height:1.5pt" o:hralign="center" o:hrstd="t" o:hr="t" fillcolor="#a0a0a0" stroked="f"/>
         </w:pict>
       </w:r>
     </w:p>
@@ -7430,7 +7716,7 @@
     <w:p>
       <w:r>
         <w:pict>
-          <v:rect id="_x0000_i1125" style="width:0;height:1.5pt" o:hralign="center" o:hrstd="t" o:hr="t" fillcolor="#a0a0a0" stroked="f"/>
+          <v:rect id="_x0000_i1041" style="width:0;height:1.5pt" o:hralign="center" o:hrstd="t" o:hr="t" fillcolor="#a0a0a0" stroked="f"/>
         </w:pict>
       </w:r>
     </w:p>
@@ -7709,7 +7995,7 @@
     <w:p>
       <w:r>
         <w:pict>
-          <v:rect id="_x0000_i1126" style="width:0;height:1.5pt" o:hralign="center" o:hrstd="t" o:hr="t" fillcolor="#a0a0a0" stroked="f"/>
+          <v:rect id="_x0000_i1042" style="width:0;height:1.5pt" o:hralign="center" o:hrstd="t" o:hr="t" fillcolor="#a0a0a0" stroked="f"/>
         </w:pict>
       </w:r>
     </w:p>
@@ -7878,7 +8164,7 @@
     <w:p>
       <w:r>
         <w:pict>
-          <v:rect id="_x0000_i1127" style="width:0;height:1.5pt" o:hralign="center" o:hrstd="t" o:hr="t" fillcolor="#a0a0a0" stroked="f"/>
+          <v:rect id="_x0000_i1043" style="width:0;height:1.5pt" o:hralign="center" o:hrstd="t" o:hr="t" fillcolor="#a0a0a0" stroked="f"/>
         </w:pict>
       </w:r>
     </w:p>
@@ -8021,7 +8307,7 @@
     <w:p>
       <w:r>
         <w:pict>
-          <v:rect id="_x0000_i1128" style="width:0;height:1.5pt" o:hralign="center" o:hrstd="t" o:hr="t" fillcolor="#a0a0a0" stroked="f"/>
+          <v:rect id="_x0000_i1044" style="width:0;height:1.5pt" o:hralign="center" o:hrstd="t" o:hr="t" fillcolor="#a0a0a0" stroked="f"/>
         </w:pict>
       </w:r>
     </w:p>
@@ -8222,7 +8508,7 @@
     <w:p>
       <w:r>
         <w:pict>
-          <v:rect id="_x0000_i1129" style="width:0;height:1.5pt" o:hralign="center" o:hrstd="t" o:hr="t" fillcolor="#a0a0a0" stroked="f"/>
+          <v:rect id="_x0000_i1045" style="width:0;height:1.5pt" o:hralign="center" o:hrstd="t" o:hr="t" fillcolor="#a0a0a0" stroked="f"/>
         </w:pict>
       </w:r>
     </w:p>
@@ -8405,7 +8691,7 @@
         </w:numPr>
       </w:pPr>
       <w:r>
-        <w:t>18</w:t>
+        <w:t>31</w:t>
       </w:r>
       <w:r>
         <w:t xml:space="preserve"> passing tests</w:t>
@@ -8662,7 +8948,7 @@
       <w:r>
         <w:lastRenderedPageBreak/>
         <w:pict>
-          <v:rect id="_x0000_i1130" style="width:0;height:1.5pt" o:hralign="center" o:hrstd="t" o:hr="t" fillcolor="#a0a0a0" stroked="f"/>
+          <v:rect id="_x0000_i1046" style="width:0;height:1.5pt" o:hralign="center" o:hrstd="t" o:hr="t" fillcolor="#a0a0a0" stroked="f"/>
         </w:pict>
       </w:r>
     </w:p>
@@ -11577,6 +11863,119 @@
     </w:lvl>
   </w:abstractNum>
   <w:abstractNum w:abstractNumId="20" w15:restartNumberingAfterBreak="0">
+    <w:nsid w:val="375A4807"/>
+    <w:multiLevelType w:val="hybridMultilevel"/>
+    <w:tmpl w:val="014C1998"/>
+    <w:lvl w:ilvl="0" w:tplc="08090001">
+      <w:start w:val="1"/>
+      <w:numFmt w:val="bullet"/>
+      <w:lvlText w:val=""/>
+      <w:lvlJc w:val="left"/>
+      <w:pPr>
+        <w:ind w:left="720" w:hanging="360"/>
+      </w:pPr>
+      <w:rPr>
+        <w:rFonts w:ascii="Symbol" w:hAnsi="Symbol" w:hint="default"/>
+      </w:rPr>
+    </w:lvl>
+    <w:lvl w:ilvl="1" w:tplc="08090003" w:tentative="1">
+      <w:start w:val="1"/>
+      <w:numFmt w:val="bullet"/>
+      <w:lvlText w:val="o"/>
+      <w:lvlJc w:val="left"/>
+      <w:pPr>
+        <w:ind w:left="1440" w:hanging="360"/>
+      </w:pPr>
+      <w:rPr>
+        <w:rFonts w:ascii="Courier New" w:hAnsi="Courier New" w:cs="Courier New" w:hint="default"/>
+      </w:rPr>
+    </w:lvl>
+    <w:lvl w:ilvl="2" w:tplc="08090005" w:tentative="1">
+      <w:start w:val="1"/>
+      <w:numFmt w:val="bullet"/>
+      <w:lvlText w:val=""/>
+      <w:lvlJc w:val="left"/>
+      <w:pPr>
+        <w:ind w:left="2160" w:hanging="360"/>
+      </w:pPr>
+      <w:rPr>
+        <w:rFonts w:ascii="Wingdings" w:hAnsi="Wingdings" w:hint="default"/>
+      </w:rPr>
+    </w:lvl>
+    <w:lvl w:ilvl="3" w:tplc="08090001" w:tentative="1">
+      <w:start w:val="1"/>
+      <w:numFmt w:val="bullet"/>
+      <w:lvlText w:val=""/>
+      <w:lvlJc w:val="left"/>
+      <w:pPr>
+        <w:ind w:left="2880" w:hanging="360"/>
+      </w:pPr>
+      <w:rPr>
+        <w:rFonts w:ascii="Symbol" w:hAnsi="Symbol" w:hint="default"/>
+      </w:rPr>
+    </w:lvl>
+    <w:lvl w:ilvl="4" w:tplc="08090003" w:tentative="1">
+      <w:start w:val="1"/>
+      <w:numFmt w:val="bullet"/>
+      <w:lvlText w:val="o"/>
+      <w:lvlJc w:val="left"/>
+      <w:pPr>
+        <w:ind w:left="3600" w:hanging="360"/>
+      </w:pPr>
+      <w:rPr>
+        <w:rFonts w:ascii="Courier New" w:hAnsi="Courier New" w:cs="Courier New" w:hint="default"/>
+      </w:rPr>
+    </w:lvl>
+    <w:lvl w:ilvl="5" w:tplc="08090005" w:tentative="1">
+      <w:start w:val="1"/>
+      <w:numFmt w:val="bullet"/>
+      <w:lvlText w:val=""/>
+      <w:lvlJc w:val="left"/>
+      <w:pPr>
+        <w:ind w:left="4320" w:hanging="360"/>
+      </w:pPr>
+      <w:rPr>
+        <w:rFonts w:ascii="Wingdings" w:hAnsi="Wingdings" w:hint="default"/>
+      </w:rPr>
+    </w:lvl>
+    <w:lvl w:ilvl="6" w:tplc="08090001" w:tentative="1">
+      <w:start w:val="1"/>
+      <w:numFmt w:val="bullet"/>
+      <w:lvlText w:val=""/>
+      <w:lvlJc w:val="left"/>
+      <w:pPr>
+        <w:ind w:left="5040" w:hanging="360"/>
+      </w:pPr>
+      <w:rPr>
+        <w:rFonts w:ascii="Symbol" w:hAnsi="Symbol" w:hint="default"/>
+      </w:rPr>
+    </w:lvl>
+    <w:lvl w:ilvl="7" w:tplc="08090003" w:tentative="1">
+      <w:start w:val="1"/>
+      <w:numFmt w:val="bullet"/>
+      <w:lvlText w:val="o"/>
+      <w:lvlJc w:val="left"/>
+      <w:pPr>
+        <w:ind w:left="5760" w:hanging="360"/>
+      </w:pPr>
+      <w:rPr>
+        <w:rFonts w:ascii="Courier New" w:hAnsi="Courier New" w:cs="Courier New" w:hint="default"/>
+      </w:rPr>
+    </w:lvl>
+    <w:lvl w:ilvl="8" w:tplc="08090005" w:tentative="1">
+      <w:start w:val="1"/>
+      <w:numFmt w:val="bullet"/>
+      <w:lvlText w:val=""/>
+      <w:lvlJc w:val="left"/>
+      <w:pPr>
+        <w:ind w:left="6480" w:hanging="360"/>
+      </w:pPr>
+      <w:rPr>
+        <w:rFonts w:ascii="Wingdings" w:hAnsi="Wingdings" w:hint="default"/>
+      </w:rPr>
+    </w:lvl>
+  </w:abstractNum>
+  <w:abstractNum w:abstractNumId="21" w15:restartNumberingAfterBreak="0">
     <w:nsid w:val="37600B3C"/>
     <w:multiLevelType w:val="multilevel"/>
     <w:tmpl w:val="44B43224"/>
@@ -11725,7 +12124,7 @@
       </w:rPr>
     </w:lvl>
   </w:abstractNum>
-  <w:abstractNum w:abstractNumId="21" w15:restartNumberingAfterBreak="0">
+  <w:abstractNum w:abstractNumId="22" w15:restartNumberingAfterBreak="0">
     <w:nsid w:val="399F41B6"/>
     <w:multiLevelType w:val="multilevel"/>
     <w:tmpl w:val="61FC6B0C"/>
@@ -11874,7 +12273,7 @@
       </w:rPr>
     </w:lvl>
   </w:abstractNum>
-  <w:abstractNum w:abstractNumId="22" w15:restartNumberingAfterBreak="0">
+  <w:abstractNum w:abstractNumId="23" w15:restartNumberingAfterBreak="0">
     <w:nsid w:val="3C3869F5"/>
     <w:multiLevelType w:val="multilevel"/>
     <w:tmpl w:val="43DCA184"/>
@@ -12023,7 +12422,7 @@
       </w:rPr>
     </w:lvl>
   </w:abstractNum>
-  <w:abstractNum w:abstractNumId="23" w15:restartNumberingAfterBreak="0">
+  <w:abstractNum w:abstractNumId="24" w15:restartNumberingAfterBreak="0">
     <w:nsid w:val="3D16436B"/>
     <w:multiLevelType w:val="multilevel"/>
     <w:tmpl w:val="6504E5EE"/>
@@ -12172,7 +12571,7 @@
       </w:rPr>
     </w:lvl>
   </w:abstractNum>
-  <w:abstractNum w:abstractNumId="24" w15:restartNumberingAfterBreak="0">
+  <w:abstractNum w:abstractNumId="25" w15:restartNumberingAfterBreak="0">
     <w:nsid w:val="44010F9E"/>
     <w:multiLevelType w:val="multilevel"/>
     <w:tmpl w:val="9CCA639E"/>
@@ -12321,7 +12720,7 @@
       </w:rPr>
     </w:lvl>
   </w:abstractNum>
-  <w:abstractNum w:abstractNumId="25" w15:restartNumberingAfterBreak="0">
+  <w:abstractNum w:abstractNumId="26" w15:restartNumberingAfterBreak="0">
     <w:nsid w:val="4AD060DA"/>
     <w:multiLevelType w:val="multilevel"/>
     <w:tmpl w:val="C750C6AE"/>
@@ -12470,7 +12869,7 @@
       </w:rPr>
     </w:lvl>
   </w:abstractNum>
-  <w:abstractNum w:abstractNumId="26" w15:restartNumberingAfterBreak="0">
+  <w:abstractNum w:abstractNumId="27" w15:restartNumberingAfterBreak="0">
     <w:nsid w:val="4DB430EC"/>
     <w:multiLevelType w:val="multilevel"/>
     <w:tmpl w:val="2E7CBF12"/>
@@ -12619,7 +13018,7 @@
       </w:rPr>
     </w:lvl>
   </w:abstractNum>
-  <w:abstractNum w:abstractNumId="27" w15:restartNumberingAfterBreak="0">
+  <w:abstractNum w:abstractNumId="28" w15:restartNumberingAfterBreak="0">
     <w:nsid w:val="54952777"/>
     <w:multiLevelType w:val="multilevel"/>
     <w:tmpl w:val="7FE04B9E"/>
@@ -12768,7 +13167,7 @@
       </w:rPr>
     </w:lvl>
   </w:abstractNum>
-  <w:abstractNum w:abstractNumId="28" w15:restartNumberingAfterBreak="0">
+  <w:abstractNum w:abstractNumId="29" w15:restartNumberingAfterBreak="0">
     <w:nsid w:val="54F035DA"/>
     <w:multiLevelType w:val="multilevel"/>
     <w:tmpl w:val="7B2EFE92"/>
@@ -12917,7 +13316,7 @@
       </w:rPr>
     </w:lvl>
   </w:abstractNum>
-  <w:abstractNum w:abstractNumId="29" w15:restartNumberingAfterBreak="0">
+  <w:abstractNum w:abstractNumId="30" w15:restartNumberingAfterBreak="0">
     <w:nsid w:val="55166DC5"/>
     <w:multiLevelType w:val="multilevel"/>
     <w:tmpl w:val="BE28754A"/>
@@ -13066,7 +13465,7 @@
       </w:rPr>
     </w:lvl>
   </w:abstractNum>
-  <w:abstractNum w:abstractNumId="30" w15:restartNumberingAfterBreak="0">
+  <w:abstractNum w:abstractNumId="31" w15:restartNumberingAfterBreak="0">
     <w:nsid w:val="58627222"/>
     <w:multiLevelType w:val="multilevel"/>
     <w:tmpl w:val="B6A2F93E"/>
@@ -13215,7 +13614,7 @@
       </w:rPr>
     </w:lvl>
   </w:abstractNum>
-  <w:abstractNum w:abstractNumId="31" w15:restartNumberingAfterBreak="0">
+  <w:abstractNum w:abstractNumId="32" w15:restartNumberingAfterBreak="0">
     <w:nsid w:val="5CB2561D"/>
     <w:multiLevelType w:val="multilevel"/>
     <w:tmpl w:val="B2365550"/>
@@ -13364,7 +13763,7 @@
       </w:rPr>
     </w:lvl>
   </w:abstractNum>
-  <w:abstractNum w:abstractNumId="32" w15:restartNumberingAfterBreak="0">
+  <w:abstractNum w:abstractNumId="33" w15:restartNumberingAfterBreak="0">
     <w:nsid w:val="62441C4A"/>
     <w:multiLevelType w:val="multilevel"/>
     <w:tmpl w:val="D7042E2E"/>
@@ -13513,7 +13912,7 @@
       </w:rPr>
     </w:lvl>
   </w:abstractNum>
-  <w:abstractNum w:abstractNumId="33" w15:restartNumberingAfterBreak="0">
+  <w:abstractNum w:abstractNumId="34" w15:restartNumberingAfterBreak="0">
     <w:nsid w:val="65FF3AF9"/>
     <w:multiLevelType w:val="multilevel"/>
     <w:tmpl w:val="6ADA9B56"/>
@@ -13662,7 +14061,7 @@
       </w:rPr>
     </w:lvl>
   </w:abstractNum>
-  <w:abstractNum w:abstractNumId="34" w15:restartNumberingAfterBreak="0">
+  <w:abstractNum w:abstractNumId="35" w15:restartNumberingAfterBreak="0">
     <w:nsid w:val="661A365D"/>
     <w:multiLevelType w:val="multilevel"/>
     <w:tmpl w:val="7772F05E"/>
@@ -13811,7 +14210,7 @@
       </w:rPr>
     </w:lvl>
   </w:abstractNum>
-  <w:abstractNum w:abstractNumId="35" w15:restartNumberingAfterBreak="0">
+  <w:abstractNum w:abstractNumId="36" w15:restartNumberingAfterBreak="0">
     <w:nsid w:val="6914611D"/>
     <w:multiLevelType w:val="multilevel"/>
     <w:tmpl w:val="B61ABADA"/>
@@ -13960,7 +14359,7 @@
       </w:rPr>
     </w:lvl>
   </w:abstractNum>
-  <w:abstractNum w:abstractNumId="36" w15:restartNumberingAfterBreak="0">
+  <w:abstractNum w:abstractNumId="37" w15:restartNumberingAfterBreak="0">
     <w:nsid w:val="6E6A2FD5"/>
     <w:multiLevelType w:val="multilevel"/>
     <w:tmpl w:val="75163DD4"/>
@@ -14109,7 +14508,7 @@
       </w:rPr>
     </w:lvl>
   </w:abstractNum>
-  <w:abstractNum w:abstractNumId="37" w15:restartNumberingAfterBreak="0">
+  <w:abstractNum w:abstractNumId="38" w15:restartNumberingAfterBreak="0">
     <w:nsid w:val="6EC8433B"/>
     <w:multiLevelType w:val="multilevel"/>
     <w:tmpl w:val="CC1616A0"/>
@@ -14258,7 +14657,7 @@
       </w:rPr>
     </w:lvl>
   </w:abstractNum>
-  <w:abstractNum w:abstractNumId="38" w15:restartNumberingAfterBreak="0">
+  <w:abstractNum w:abstractNumId="39" w15:restartNumberingAfterBreak="0">
     <w:nsid w:val="6FC41025"/>
     <w:multiLevelType w:val="multilevel"/>
     <w:tmpl w:val="1F3E1350"/>
@@ -14407,7 +14806,7 @@
       </w:rPr>
     </w:lvl>
   </w:abstractNum>
-  <w:abstractNum w:abstractNumId="39" w15:restartNumberingAfterBreak="0">
+  <w:abstractNum w:abstractNumId="40" w15:restartNumberingAfterBreak="0">
     <w:nsid w:val="71A10A5F"/>
     <w:multiLevelType w:val="multilevel"/>
     <w:tmpl w:val="452294BC"/>
@@ -14556,7 +14955,7 @@
       </w:rPr>
     </w:lvl>
   </w:abstractNum>
-  <w:abstractNum w:abstractNumId="40" w15:restartNumberingAfterBreak="0">
+  <w:abstractNum w:abstractNumId="41" w15:restartNumberingAfterBreak="0">
     <w:nsid w:val="73C92592"/>
     <w:multiLevelType w:val="multilevel"/>
     <w:tmpl w:val="2B0AA8A6"/>
@@ -14705,7 +15104,7 @@
       </w:rPr>
     </w:lvl>
   </w:abstractNum>
-  <w:abstractNum w:abstractNumId="41" w15:restartNumberingAfterBreak="0">
+  <w:abstractNum w:abstractNumId="42" w15:restartNumberingAfterBreak="0">
     <w:nsid w:val="750A4365"/>
     <w:multiLevelType w:val="multilevel"/>
     <w:tmpl w:val="993C160A"/>
@@ -14854,7 +15253,120 @@
       </w:rPr>
     </w:lvl>
   </w:abstractNum>
-  <w:abstractNum w:abstractNumId="42" w15:restartNumberingAfterBreak="0">
+  <w:abstractNum w:abstractNumId="43" w15:restartNumberingAfterBreak="0">
+    <w:nsid w:val="757565F2"/>
+    <w:multiLevelType w:val="hybridMultilevel"/>
+    <w:tmpl w:val="A72EF85C"/>
+    <w:lvl w:ilvl="0" w:tplc="08090001">
+      <w:start w:val="1"/>
+      <w:numFmt w:val="bullet"/>
+      <w:lvlText w:val=""/>
+      <w:lvlJc w:val="left"/>
+      <w:pPr>
+        <w:ind w:left="720" w:hanging="360"/>
+      </w:pPr>
+      <w:rPr>
+        <w:rFonts w:ascii="Symbol" w:hAnsi="Symbol" w:hint="default"/>
+      </w:rPr>
+    </w:lvl>
+    <w:lvl w:ilvl="1" w:tplc="08090003" w:tentative="1">
+      <w:start w:val="1"/>
+      <w:numFmt w:val="bullet"/>
+      <w:lvlText w:val="o"/>
+      <w:lvlJc w:val="left"/>
+      <w:pPr>
+        <w:ind w:left="1440" w:hanging="360"/>
+      </w:pPr>
+      <w:rPr>
+        <w:rFonts w:ascii="Courier New" w:hAnsi="Courier New" w:cs="Courier New" w:hint="default"/>
+      </w:rPr>
+    </w:lvl>
+    <w:lvl w:ilvl="2" w:tplc="08090005" w:tentative="1">
+      <w:start w:val="1"/>
+      <w:numFmt w:val="bullet"/>
+      <w:lvlText w:val=""/>
+      <w:lvlJc w:val="left"/>
+      <w:pPr>
+        <w:ind w:left="2160" w:hanging="360"/>
+      </w:pPr>
+      <w:rPr>
+        <w:rFonts w:ascii="Wingdings" w:hAnsi="Wingdings" w:hint="default"/>
+      </w:rPr>
+    </w:lvl>
+    <w:lvl w:ilvl="3" w:tplc="08090001" w:tentative="1">
+      <w:start w:val="1"/>
+      <w:numFmt w:val="bullet"/>
+      <w:lvlText w:val=""/>
+      <w:lvlJc w:val="left"/>
+      <w:pPr>
+        <w:ind w:left="2880" w:hanging="360"/>
+      </w:pPr>
+      <w:rPr>
+        <w:rFonts w:ascii="Symbol" w:hAnsi="Symbol" w:hint="default"/>
+      </w:rPr>
+    </w:lvl>
+    <w:lvl w:ilvl="4" w:tplc="08090003" w:tentative="1">
+      <w:start w:val="1"/>
+      <w:numFmt w:val="bullet"/>
+      <w:lvlText w:val="o"/>
+      <w:lvlJc w:val="left"/>
+      <w:pPr>
+        <w:ind w:left="3600" w:hanging="360"/>
+      </w:pPr>
+      <w:rPr>
+        <w:rFonts w:ascii="Courier New" w:hAnsi="Courier New" w:cs="Courier New" w:hint="default"/>
+      </w:rPr>
+    </w:lvl>
+    <w:lvl w:ilvl="5" w:tplc="08090005" w:tentative="1">
+      <w:start w:val="1"/>
+      <w:numFmt w:val="bullet"/>
+      <w:lvlText w:val=""/>
+      <w:lvlJc w:val="left"/>
+      <w:pPr>
+        <w:ind w:left="4320" w:hanging="360"/>
+      </w:pPr>
+      <w:rPr>
+        <w:rFonts w:ascii="Wingdings" w:hAnsi="Wingdings" w:hint="default"/>
+      </w:rPr>
+    </w:lvl>
+    <w:lvl w:ilvl="6" w:tplc="08090001" w:tentative="1">
+      <w:start w:val="1"/>
+      <w:numFmt w:val="bullet"/>
+      <w:lvlText w:val=""/>
+      <w:lvlJc w:val="left"/>
+      <w:pPr>
+        <w:ind w:left="5040" w:hanging="360"/>
+      </w:pPr>
+      <w:rPr>
+        <w:rFonts w:ascii="Symbol" w:hAnsi="Symbol" w:hint="default"/>
+      </w:rPr>
+    </w:lvl>
+    <w:lvl w:ilvl="7" w:tplc="08090003" w:tentative="1">
+      <w:start w:val="1"/>
+      <w:numFmt w:val="bullet"/>
+      <w:lvlText w:val="o"/>
+      <w:lvlJc w:val="left"/>
+      <w:pPr>
+        <w:ind w:left="5760" w:hanging="360"/>
+      </w:pPr>
+      <w:rPr>
+        <w:rFonts w:ascii="Courier New" w:hAnsi="Courier New" w:cs="Courier New" w:hint="default"/>
+      </w:rPr>
+    </w:lvl>
+    <w:lvl w:ilvl="8" w:tplc="08090005" w:tentative="1">
+      <w:start w:val="1"/>
+      <w:numFmt w:val="bullet"/>
+      <w:lvlText w:val=""/>
+      <w:lvlJc w:val="left"/>
+      <w:pPr>
+        <w:ind w:left="6480" w:hanging="360"/>
+      </w:pPr>
+      <w:rPr>
+        <w:rFonts w:ascii="Wingdings" w:hAnsi="Wingdings" w:hint="default"/>
+      </w:rPr>
+    </w:lvl>
+  </w:abstractNum>
+  <w:abstractNum w:abstractNumId="44" w15:restartNumberingAfterBreak="0">
     <w:nsid w:val="764575CA"/>
     <w:multiLevelType w:val="multilevel"/>
     <w:tmpl w:val="329018F6"/>
@@ -15003,7 +15515,7 @@
       </w:rPr>
     </w:lvl>
   </w:abstractNum>
-  <w:abstractNum w:abstractNumId="43" w15:restartNumberingAfterBreak="0">
+  <w:abstractNum w:abstractNumId="45" w15:restartNumberingAfterBreak="0">
     <w:nsid w:val="77176E43"/>
     <w:multiLevelType w:val="multilevel"/>
     <w:tmpl w:val="B4D62156"/>
@@ -15152,7 +15664,7 @@
       </w:rPr>
     </w:lvl>
   </w:abstractNum>
-  <w:abstractNum w:abstractNumId="44" w15:restartNumberingAfterBreak="0">
+  <w:abstractNum w:abstractNumId="46" w15:restartNumberingAfterBreak="0">
     <w:nsid w:val="7B4B4025"/>
     <w:multiLevelType w:val="multilevel"/>
     <w:tmpl w:val="2D4045FE"/>
@@ -15302,31 +15814,31 @@
     </w:lvl>
   </w:abstractNum>
   <w:num w:numId="1">
-    <w:abstractNumId w:val="23"/>
+    <w:abstractNumId w:val="24"/>
   </w:num>
   <w:num w:numId="2">
-    <w:abstractNumId w:val="24"/>
+    <w:abstractNumId w:val="25"/>
   </w:num>
   <w:num w:numId="3">
     <w:abstractNumId w:val="2"/>
   </w:num>
   <w:num w:numId="4">
-    <w:abstractNumId w:val="40"/>
+    <w:abstractNumId w:val="41"/>
   </w:num>
   <w:num w:numId="5">
-    <w:abstractNumId w:val="22"/>
+    <w:abstractNumId w:val="23"/>
   </w:num>
   <w:num w:numId="6">
-    <w:abstractNumId w:val="41"/>
+    <w:abstractNumId w:val="42"/>
   </w:num>
   <w:num w:numId="7">
-    <w:abstractNumId w:val="42"/>
+    <w:abstractNumId w:val="44"/>
   </w:num>
   <w:num w:numId="8">
-    <w:abstractNumId w:val="37"/>
+    <w:abstractNumId w:val="38"/>
   </w:num>
   <w:num w:numId="9">
-    <w:abstractNumId w:val="21"/>
+    <w:abstractNumId w:val="22"/>
   </w:num>
   <w:num w:numId="10">
     <w:abstractNumId w:val="3"/>
@@ -15335,22 +15847,22 @@
     <w:abstractNumId w:val="19"/>
   </w:num>
   <w:num w:numId="12">
-    <w:abstractNumId w:val="20"/>
+    <w:abstractNumId w:val="21"/>
   </w:num>
   <w:num w:numId="13">
-    <w:abstractNumId w:val="39"/>
+    <w:abstractNumId w:val="40"/>
   </w:num>
   <w:num w:numId="14">
     <w:abstractNumId w:val="15"/>
   </w:num>
   <w:num w:numId="15">
-    <w:abstractNumId w:val="30"/>
+    <w:abstractNumId w:val="31"/>
   </w:num>
   <w:num w:numId="16">
     <w:abstractNumId w:val="18"/>
   </w:num>
   <w:num w:numId="17">
-    <w:abstractNumId w:val="31"/>
+    <w:abstractNumId w:val="32"/>
   </w:num>
   <w:num w:numId="18">
     <w:abstractNumId w:val="12"/>
@@ -15359,22 +15871,22 @@
     <w:abstractNumId w:val="17"/>
   </w:num>
   <w:num w:numId="20">
-    <w:abstractNumId w:val="33"/>
+    <w:abstractNumId w:val="34"/>
   </w:num>
   <w:num w:numId="21">
-    <w:abstractNumId w:val="28"/>
+    <w:abstractNumId w:val="29"/>
   </w:num>
   <w:num w:numId="22">
-    <w:abstractNumId w:val="29"/>
+    <w:abstractNumId w:val="30"/>
   </w:num>
   <w:num w:numId="23">
     <w:abstractNumId w:val="6"/>
   </w:num>
   <w:num w:numId="24">
-    <w:abstractNumId w:val="25"/>
+    <w:abstractNumId w:val="26"/>
   </w:num>
   <w:num w:numId="25">
-    <w:abstractNumId w:val="27"/>
+    <w:abstractNumId w:val="28"/>
   </w:num>
   <w:num w:numId="26">
     <w:abstractNumId w:val="4"/>
@@ -15386,16 +15898,16 @@
     <w:abstractNumId w:val="10"/>
   </w:num>
   <w:num w:numId="29">
-    <w:abstractNumId w:val="32"/>
+    <w:abstractNumId w:val="33"/>
   </w:num>
   <w:num w:numId="30">
-    <w:abstractNumId w:val="43"/>
+    <w:abstractNumId w:val="45"/>
   </w:num>
   <w:num w:numId="31">
     <w:abstractNumId w:val="7"/>
   </w:num>
   <w:num w:numId="32">
-    <w:abstractNumId w:val="44"/>
+    <w:abstractNumId w:val="46"/>
   </w:num>
   <w:num w:numId="33">
     <w:abstractNumId w:val="16"/>
@@ -15407,13 +15919,13 @@
     <w:abstractNumId w:val="14"/>
   </w:num>
   <w:num w:numId="36">
+    <w:abstractNumId w:val="36"/>
+  </w:num>
+  <w:num w:numId="37">
     <w:abstractNumId w:val="35"/>
   </w:num>
-  <w:num w:numId="37">
-    <w:abstractNumId w:val="34"/>
-  </w:num>
   <w:num w:numId="38">
-    <w:abstractNumId w:val="38"/>
+    <w:abstractNumId w:val="39"/>
   </w:num>
   <w:num w:numId="39">
     <w:abstractNumId w:val="8"/>
@@ -15425,16 +15937,22 @@
     <w:abstractNumId w:val="11"/>
   </w:num>
   <w:num w:numId="42">
-    <w:abstractNumId w:val="26"/>
+    <w:abstractNumId w:val="27"/>
   </w:num>
   <w:num w:numId="43">
-    <w:abstractNumId w:val="36"/>
+    <w:abstractNumId w:val="37"/>
   </w:num>
   <w:num w:numId="44">
     <w:abstractNumId w:val="1"/>
   </w:num>
   <w:num w:numId="45">
     <w:abstractNumId w:val="0"/>
+  </w:num>
+  <w:num w:numId="46">
+    <w:abstractNumId w:val="43"/>
+  </w:num>
+  <w:num w:numId="47">
+    <w:abstractNumId w:val="20"/>
   </w:num>
   <w:numIdMacAtCleanup w:val="45"/>
 </w:numbering>
@@ -15971,7 +16489,6 @@
     <w:name w:val="Normal (Web)"/>
     <w:basedOn w:val="Normal"/>
     <w:uiPriority w:val="99"/>
-    <w:semiHidden/>
     <w:unhideWhenUsed/>
     <w:rsid w:val="001D5DC3"/>
     <w:pPr>

</xml_diff>